<commit_message>
Alta de cliente responde 201 y prueba de API unica en Postman y REST Assured
- POST /api/clientes responde 201 Created en el alta y 200 OK en la modificacion.
- Un solo caso de prueba, el mismo en las dos herramientas: POST /api/clientes
  con las mismas cabeceras, el mismo body JSON y las mismas comprobaciones.
- Coleccion de Postman con una sola peticion (login automatico y limpieza por
  script) y clase RegistrarClienteRestAssuredTest con JUnit 5.
- Guia de la IE2 actualizada.
</commit_message>
<xml_diff>
--- a/docs/ie2/IE2_Equipo5_Postman_vs_RestAssured.docx
+++ b/docs/ie2/IE2_Equipo5_Postman_vs_RestAssured.docx
@@ -111,14 +111,14 @@
           <w:b/>
           <w:i w:val="0"/>
         </w:rPr>
-        <w:t>Casos de prueba:</w:t>
+        <w:t>Caso de prueba:</w:t>
       </w:r>
       <w:r>
         <w:rPr>
           <w:b w:val="0"/>
           <w:i w:val="0"/>
         </w:rPr>
-        <w:t xml:space="preserve"> Verificación del contrato de POST /api/clientes y Validación de la historia de usuario "cliente con cuenta corriente"</w:t>
+        <w:t xml:space="preserve"> registrar un cliente con cuenta corriente — una sola petición POST /api/clientes, la misma en Postman y en REST Assured</w:t>
       </w:r>
     </w:p>
     <w:p>
@@ -188,7 +188,7 @@
                 <w:b w:val="0"/>
                 <w:sz w:val="18"/>
               </w:rPr>
-              <w:t>Presentar los criterios del mapa comparativo GUI vs. código nativo.</w:t>
+              <w:t>Presentar los criterios del mapa comparativo para elegir entre herramientas GUI y librerías de código.</w:t>
             </w:r>
           </w:p>
         </w:tc>
@@ -220,7 +220,21 @@
                 <w:b w:val="0"/>
                 <w:sz w:val="18"/>
               </w:rPr>
-              <w:t>Ejecutar en vivo un POST en Postman mostrando cabeceras, body JSON y estado HTTP.</w:t>
+              <w:t xml:space="preserve">Ejecutar en vivo </w:t>
+            </w:r>
+            <w:r>
+              <w:rPr>
+                <w:b/>
+                <w:sz w:val="18"/>
+              </w:rPr>
+              <w:t>una petición HTTP POST</w:t>
+            </w:r>
+            <w:r>
+              <w:rPr>
+                <w:b w:val="0"/>
+                <w:sz w:val="18"/>
+              </w:rPr>
+              <w:t xml:space="preserve"> en Postman, mostrando cabeceras, body JSON y estado HTTP.</w:t>
             </w:r>
           </w:p>
         </w:tc>
@@ -235,35 +249,21 @@
                 <w:b w:val="0"/>
                 <w:sz w:val="18"/>
               </w:rPr>
-              <w:t xml:space="preserve">Colección "GestaPro - API Clientes" con dos carpetas: </w:t>
+              <w:t xml:space="preserve">Colección con </w:t>
             </w:r>
             <w:r>
               <w:rPr>
                 <w:b/>
                 <w:sz w:val="18"/>
               </w:rPr>
-              <w:t>Verificación</w:t>
+              <w:t>una sola petición</w:t>
             </w:r>
             <w:r>
               <w:rPr>
                 <w:b w:val="0"/>
                 <w:sz w:val="18"/>
               </w:rPr>
-              <w:t xml:space="preserve"> (contrato de POST /api/clientes) y </w:t>
-            </w:r>
-            <w:r>
-              <w:rPr>
-                <w:b/>
-                <w:sz w:val="18"/>
-              </w:rPr>
-              <w:t>Validación</w:t>
-            </w:r>
-            <w:r>
-              <w:rPr>
-                <w:b w:val="0"/>
-                <w:sz w:val="18"/>
-              </w:rPr>
-              <w:t xml:space="preserve"> (historia de usuario completa). Pestañas Headers, Body, Status y Test Results.</w:t>
+              <w:t>: "Registrar cliente (POST /api/clientes)". Se muestran las pestañas Headers, Body, el Status 201 Created y Test Results.</w:t>
             </w:r>
           </w:p>
         </w:tc>
@@ -280,7 +280,21 @@
                 <w:b w:val="0"/>
                 <w:sz w:val="18"/>
               </w:rPr>
-              <w:t>Ejecutar exactamente el mismo caso en Java con REST Assured + JUnit 5 desde el IDE.</w:t>
+              <w:t xml:space="preserve">Ejecutar </w:t>
+            </w:r>
+            <w:r>
+              <w:rPr>
+                <w:b/>
+                <w:sz w:val="18"/>
+              </w:rPr>
+              <w:t>exactamente el mismo caso</w:t>
+            </w:r>
+            <w:r>
+              <w:rPr>
+                <w:b w:val="0"/>
+                <w:sz w:val="18"/>
+              </w:rPr>
+              <w:t xml:space="preserve"> en Java con REST Assured desde el IDE con JUnit 5.</w:t>
             </w:r>
           </w:p>
         </w:tc>
@@ -295,35 +309,21 @@
                 <w:b w:val="0"/>
                 <w:sz w:val="18"/>
               </w:rPr>
-              <w:t xml:space="preserve">Dos clases con los mismos casos y las mismas comprobaciones: </w:t>
+              <w:t xml:space="preserve">Clase </w:t>
             </w:r>
             <w:r>
               <w:rPr>
                 <w:b/>
                 <w:sz w:val="18"/>
               </w:rPr>
-              <w:t>ClientesApiVerificacionTest</w:t>
+              <w:t>RegistrarClienteRestAssuredTest</w:t>
             </w:r>
             <w:r>
               <w:rPr>
                 <w:b w:val="0"/>
                 <w:sz w:val="18"/>
               </w:rPr>
-              <w:t xml:space="preserve"> y </w:t>
-            </w:r>
-            <w:r>
-              <w:rPr>
-                <w:b/>
-                <w:sz w:val="18"/>
-              </w:rPr>
-              <w:t>ClientesApiValidacionTest</w:t>
-            </w:r>
-            <w:r>
-              <w:rPr>
-                <w:b w:val="0"/>
-                <w:sz w:val="18"/>
-              </w:rPr>
-              <w:t>.</w:t>
+              <w:t>: el mismo POST, con las mismas cabeceras, el mismo body JSON y las mismas 10 comprobaciones (sección 2).</w:t>
             </w:r>
           </w:p>
         </w:tc>
@@ -340,7 +340,7 @@
                 <w:b w:val="0"/>
                 <w:sz w:val="18"/>
               </w:rPr>
-              <w:t>Comparar ambas herramientas en facilidad de uso, mantenibilidad e integración en automatizaciones.</w:t>
+              <w:t>Comparar facilidad de uso, mantenibilidad e integración en automatizaciones.</w:t>
             </w:r>
           </w:p>
         </w:tc>
@@ -355,7 +355,7 @@
                 <w:b w:val="0"/>
                 <w:sz w:val="18"/>
               </w:rPr>
-              <w:t>Minutos 9–10 y sección 5: conclusión con cuándo conviene cada una.</w:t>
+              <w:t>Minutos 9–10 y sección 5.</w:t>
             </w:r>
           </w:p>
         </w:tc>
@@ -368,10 +368,29 @@
     </w:p>
     <w:p>
       <w:pPr>
+        <w:spacing w:after="80"/>
+      </w:pPr>
+      <w:r>
+        <w:rPr>
+          <w:b/>
+          <w:i w:val="0"/>
+        </w:rPr>
+        <w:t>Clasificación (minutos 1–2 de los lineamientos): es Verificación.</w:t>
+      </w:r>
+      <w:r>
+        <w:rPr>
+          <w:b w:val="0"/>
+          <w:i w:val="0"/>
+        </w:rPr>
+        <w:t xml:space="preserve"> Comprobamos que el endpoint cumple su especificación: código de estado, cabeceras y el JSON que devuelve. "¿Estamos construyendo el producto correctamente?" La Validación respondería otra pregunta ("¿estamos construyendo el producto correcto?") y se hace con el usuario, por ejemplo con una prueba de aceptación desde la pantalla.</w:t>
+      </w:r>
+    </w:p>
+    <w:p>
+      <w:pPr>
         <w:pStyle w:val="Heading1"/>
       </w:pPr>
       <w:r>
-        <w:t>2. Verificación y Validación con cada herramienta</w:t>
+        <w:t>2. El caso de prueba: el mismo en las dos herramientas</w:t>
       </w:r>
     </w:p>
     <w:p>
@@ -380,24 +399,31 @@
       </w:pPr>
       <w:r>
         <w:rPr>
+          <w:b/>
+          <w:i w:val="0"/>
+        </w:rPr>
+        <w:t>Negocio:</w:t>
+      </w:r>
+      <w:r>
+        <w:rPr>
           <w:b w:val="0"/>
           <w:i w:val="0"/>
         </w:rPr>
-        <w:t xml:space="preserve">Hacemos </w:t>
+        <w:t xml:space="preserve"> en El Sur, el Dueño registra a un cliente habitual con cuenta corriente y un límite de crédito de $15.000 para poder venderle a cuenta. El frontend lo hace con un </w:t>
       </w:r>
       <w:r>
         <w:rPr>
           <w:b/>
           <w:i w:val="0"/>
         </w:rPr>
-        <w:t>dos pruebas con cada herramienta</w:t>
+        <w:t>POST /api/clientes</w:t>
       </w:r>
       <w:r>
         <w:rPr>
           <w:b w:val="0"/>
           <w:i w:val="0"/>
         </w:rPr>
-        <w:t>: una de Verificación y otra de Validación, sobre el mismo módulo (clientes con cuenta corriente).</w:t>
+        <w:t>, enviando el token JWT del login.</w:t>
       </w:r>
     </w:p>
     <w:tbl>
@@ -415,7 +441,7 @@
       <w:tr>
         <w:tc>
           <w:tcPr>
-            <w:tcW w:type="dxa" w:w="1871"/>
+            <w:tcW w:type="dxa" w:w="2041"/>
             <w:shd w:val="clear" w:fill="5B3FA8"/>
           </w:tcPr>
           <w:p>
@@ -426,12 +452,13 @@
                 <w:color w:val="FFFFFF"/>
                 <w:sz w:val="19"/>
               </w:rPr>
+              <w:t>Parte del caso</w:t>
             </w:r>
           </w:p>
         </w:tc>
         <w:tc>
           <w:tcPr>
-            <w:tcW w:type="dxa" w:w="3742"/>
+            <w:tcW w:type="dxa" w:w="3628"/>
             <w:shd w:val="clear" w:fill="5B3FA8"/>
           </w:tcPr>
           <w:p>
@@ -442,13 +469,13 @@
                 <w:color w:val="FFFFFF"/>
                 <w:sz w:val="19"/>
               </w:rPr>
-              <w:t>Verificación</w:t>
+              <w:t>Postman</w:t>
             </w:r>
           </w:p>
         </w:tc>
         <w:tc>
           <w:tcPr>
-            <w:tcW w:type="dxa" w:w="3912"/>
+            <w:tcW w:type="dxa" w:w="3855"/>
             <w:shd w:val="clear" w:fill="5B3FA8"/>
           </w:tcPr>
           <w:p>
@@ -459,7 +486,7 @@
                 <w:color w:val="FFFFFF"/>
                 <w:sz w:val="19"/>
               </w:rPr>
-              <w:t>Validación</w:t>
+              <w:t>REST Assured (Java)</w:t>
             </w:r>
           </w:p>
         </w:tc>
@@ -467,7 +494,7 @@
       <w:tr>
         <w:tc>
           <w:tcPr>
-            <w:tcW w:type="dxa" w:w="1871"/>
+            <w:tcW w:type="dxa" w:w="2041"/>
           </w:tcPr>
           <w:p>
             <w:r/>
@@ -476,59 +503,13 @@
                 <w:b w:val="0"/>
                 <w:sz w:val="18"/>
               </w:rPr>
-              <w:t>Pregunta que responde</w:t>
+              <w:t>Preparación: obtener el token</w:t>
             </w:r>
           </w:p>
         </w:tc>
         <w:tc>
           <w:tcPr>
-            <w:tcW w:type="dxa" w:w="3742"/>
-          </w:tcPr>
-          <w:p>
-            <w:r/>
-            <w:r>
-              <w:rPr>
-                <w:b/>
-                <w:sz w:val="18"/>
-              </w:rPr>
-              <w:t>¿Construimos el producto correctamente?</w:t>
-            </w:r>
-            <w:r>
-              <w:rPr>
-                <w:b w:val="0"/>
-                <w:sz w:val="18"/>
-              </w:rPr>
-              <w:t xml:space="preserve"> ¿La API cumple su especificación técnica?</w:t>
-            </w:r>
-          </w:p>
-        </w:tc>
-        <w:tc>
-          <w:tcPr>
-            <w:tcW w:type="dxa" w:w="3912"/>
-          </w:tcPr>
-          <w:p>
-            <w:r/>
-            <w:r>
-              <w:rPr>
-                <w:b/>
-                <w:sz w:val="18"/>
-              </w:rPr>
-              <w:t>¿Construimos el producto correcto?</w:t>
-            </w:r>
-            <w:r>
-              <w:rPr>
-                <w:b w:val="0"/>
-                <w:sz w:val="18"/>
-              </w:rPr>
-              <w:t xml:space="preserve"> ¿El sistema resuelve lo que necesita el usuario?</w:t>
-            </w:r>
-          </w:p>
-        </w:tc>
-      </w:tr>
-      <w:tr>
-        <w:tc>
-          <w:tcPr>
-            <w:tcW w:type="dxa" w:w="1871"/>
+            <w:tcW w:type="dxa" w:w="3628"/>
           </w:tcPr>
           <w:p>
             <w:r/>
@@ -537,13 +518,13 @@
                 <w:b w:val="0"/>
                 <w:sz w:val="18"/>
               </w:rPr>
-              <w:t>Contra qué se compara</w:t>
+              <w:t>Script de la colección: hace el login solo antes de la petición.</w:t>
             </w:r>
           </w:p>
         </w:tc>
         <w:tc>
           <w:tcPr>
-            <w:tcW w:type="dxa" w:w="3742"/>
+            <w:tcW w:type="dxa" w:w="3855"/>
           </w:tcPr>
           <w:p>
             <w:r/>
@@ -552,13 +533,15 @@
                 <w:b w:val="0"/>
                 <w:sz w:val="18"/>
               </w:rPr>
-              <w:t>El contrato del endpoint: códigos HTTP, estructura del JSON, reglas y seguridad.</w:t>
+              <w:t>@BeforeEach: hace el login antes del test.</w:t>
             </w:r>
           </w:p>
         </w:tc>
+      </w:tr>
+      <w:tr>
         <w:tc>
           <w:tcPr>
-            <w:tcW w:type="dxa" w:w="3912"/>
+            <w:tcW w:type="dxa" w:w="2041"/>
           </w:tcPr>
           <w:p>
             <w:r/>
@@ -567,15 +550,13 @@
                 <w:b w:val="0"/>
                 <w:sz w:val="18"/>
               </w:rPr>
-              <w:t>Los criterios de aceptación de las historias de usuario GP.26, GP.27, GP.36 y GP.37.</w:t>
+              <w:t>Método y URL</w:t>
             </w:r>
           </w:p>
         </w:tc>
-      </w:tr>
-      <w:tr>
         <w:tc>
           <w:tcPr>
-            <w:tcW w:type="dxa" w:w="1871"/>
+            <w:tcW w:type="dxa" w:w="3628"/>
           </w:tcPr>
           <w:p>
             <w:r/>
@@ -584,13 +565,13 @@
                 <w:b w:val="0"/>
                 <w:sz w:val="18"/>
               </w:rPr>
-              <w:t>Qué hace la prueba</w:t>
+              <w:t>POST {{baseUrl}}/api/clientes</w:t>
             </w:r>
           </w:p>
         </w:tc>
         <w:tc>
           <w:tcPr>
-            <w:tcW w:type="dxa" w:w="3742"/>
+            <w:tcW w:type="dxa" w:w="3855"/>
           </w:tcPr>
           <w:p>
             <w:r/>
@@ -599,69 +580,15 @@
                 <w:b w:val="0"/>
                 <w:sz w:val="18"/>
               </w:rPr>
-              <w:t xml:space="preserve">POST /api/clientes: </w:t>
-            </w:r>
-            <w:r>
-              <w:rPr>
-                <w:b/>
-                <w:sz w:val="18"/>
-              </w:rPr>
-              <w:t>200</w:t>
-            </w:r>
-            <w:r>
-              <w:rPr>
-                <w:b w:val="0"/>
-                <w:sz w:val="18"/>
-              </w:rPr>
-              <w:t xml:space="preserve"> con el JSON correcto, </w:t>
-            </w:r>
-            <w:r>
-              <w:rPr>
-                <w:b/>
-                <w:sz w:val="18"/>
-              </w:rPr>
-              <w:t>409</w:t>
-            </w:r>
-            <w:r>
-              <w:rPr>
-                <w:b w:val="0"/>
-                <w:sz w:val="18"/>
-              </w:rPr>
-              <w:t xml:space="preserve"> si se repite, </w:t>
-            </w:r>
-            <w:r>
-              <w:rPr>
-                <w:b/>
-                <w:sz w:val="18"/>
-              </w:rPr>
-              <w:t>400</w:t>
-            </w:r>
-            <w:r>
-              <w:rPr>
-                <w:b w:val="0"/>
-                <w:sz w:val="18"/>
-              </w:rPr>
-              <w:t xml:space="preserve"> con límite negativo y </w:t>
-            </w:r>
-            <w:r>
-              <w:rPr>
-                <w:b/>
-                <w:sz w:val="18"/>
-              </w:rPr>
-              <w:t>401</w:t>
-            </w:r>
-            <w:r>
-              <w:rPr>
-                <w:b w:val="0"/>
-                <w:sz w:val="18"/>
-              </w:rPr>
-              <w:t xml:space="preserve"> sin token.</w:t>
+              <w:t>.when().post("/clientes")</w:t>
             </w:r>
           </w:p>
         </w:tc>
+      </w:tr>
+      <w:tr>
         <w:tc>
           <w:tcPr>
-            <w:tcW w:type="dxa" w:w="3912"/>
+            <w:tcW w:type="dxa" w:w="2041"/>
           </w:tcPr>
           <w:p>
             <w:r/>
@@ -670,15 +597,13 @@
                 <w:b w:val="0"/>
                 <w:sz w:val="18"/>
               </w:rPr>
-              <w:t>El Dueño registra un cliente con límite de $15.000 → lo encuentra en el listado, activo → su cuenta corriente arranca en $0 y sin movimientos → le sube el límite a $20.000 y se refleja → al final se borra el cliente de prueba.</w:t>
+              <w:t>Cabeceras</w:t>
             </w:r>
           </w:p>
         </w:tc>
-      </w:tr>
-      <w:tr>
         <w:tc>
           <w:tcPr>
-            <w:tcW w:type="dxa" w:w="1871"/>
+            <w:tcW w:type="dxa" w:w="3628"/>
           </w:tcPr>
           <w:p>
             <w:r/>
@@ -687,13 +612,13 @@
                 <w:b w:val="0"/>
                 <w:sz w:val="18"/>
               </w:rPr>
-              <w:t>Dónde corre</w:t>
+              <w:t>Pestaña Headers: Authorization: Bearer {{token}} y Content-Type: application/json</w:t>
             </w:r>
           </w:p>
         </w:tc>
         <w:tc>
           <w:tcPr>
-            <w:tcW w:type="dxa" w:w="3742"/>
+            <w:tcW w:type="dxa" w:w="3855"/>
           </w:tcPr>
           <w:p>
             <w:r/>
@@ -702,27 +627,15 @@
                 <w:b w:val="0"/>
                 <w:sz w:val="18"/>
               </w:rPr>
-              <w:t xml:space="preserve">Solo en el </w:t>
-            </w:r>
-            <w:r>
-              <w:rPr>
-                <w:b/>
-                <w:sz w:val="18"/>
-              </w:rPr>
-              <w:t>backend local de prueba</w:t>
-            </w:r>
-            <w:r>
-              <w:rPr>
-                <w:b w:val="0"/>
-                <w:sz w:val="18"/>
-              </w:rPr>
-              <w:t xml:space="preserve"> (base H2 en memoria). La colección tiene un seguro: si el entorno no es localhost, no manda nada.</w:t>
+              <w:t>.header("Authorization", "Bearer " + token) y .contentType(ContentType.JSON)</w:t>
             </w:r>
           </w:p>
         </w:tc>
+      </w:tr>
+      <w:tr>
         <w:tc>
           <w:tcPr>
-            <w:tcW w:type="dxa" w:w="3912"/>
+            <w:tcW w:type="dxa" w:w="2041"/>
           </w:tcPr>
           <w:p>
             <w:r/>
@@ -731,29 +644,13 @@
                 <w:b w:val="0"/>
                 <w:sz w:val="18"/>
               </w:rPr>
-              <w:t xml:space="preserve">En local </w:t>
-            </w:r>
-            <w:r>
-              <w:rPr>
-                <w:b/>
-                <w:sz w:val="18"/>
-              </w:rPr>
-              <w:t>o en la app publicada</w:t>
-            </w:r>
-            <w:r>
-              <w:rPr>
-                <w:b w:val="0"/>
-                <w:sz w:val="18"/>
-              </w:rPr>
-              <w:t xml:space="preserve"> (Render, la que usa el frontend de Vercel), porque se limpia sola y no deja datos.</w:t>
+              <w:t>Body JSON</w:t>
             </w:r>
           </w:p>
         </w:tc>
-      </w:tr>
-      <w:tr>
         <w:tc>
           <w:tcPr>
-            <w:tcW w:type="dxa" w:w="1871"/>
+            <w:tcW w:type="dxa" w:w="3628"/>
           </w:tcPr>
           <w:p>
             <w:r/>
@@ -762,13 +659,13 @@
                 <w:b w:val="0"/>
                 <w:sz w:val="18"/>
               </w:rPr>
-              <w:t>En Postman</w:t>
+              <w:t>Pestaña Body (raw / JSON): el cliente con su persona y su dirección.</w:t>
             </w:r>
           </w:p>
         </w:tc>
         <w:tc>
           <w:tcPr>
-            <w:tcW w:type="dxa" w:w="3742"/>
+            <w:tcW w:type="dxa" w:w="3855"/>
           </w:tcPr>
           <w:p>
             <w:r/>
@@ -777,13 +674,15 @@
                 <w:b w:val="0"/>
                 <w:sz w:val="18"/>
               </w:rPr>
-              <w:t>Carpeta "1. Verificación (contrato de la API)": login + 4 peticiones.</w:t>
+              <w:t>.body(Map.of(...)): el mismo JSON.</w:t>
             </w:r>
           </w:p>
         </w:tc>
+      </w:tr>
+      <w:tr>
         <w:tc>
           <w:tcPr>
-            <w:tcW w:type="dxa" w:w="3912"/>
+            <w:tcW w:type="dxa" w:w="2041"/>
           </w:tcPr>
           <w:p>
             <w:r/>
@@ -792,15 +691,13 @@
                 <w:b w:val="0"/>
                 <w:sz w:val="18"/>
               </w:rPr>
-              <w:t>Carpeta "2. Validación (historia de usuario…)": login + 8 pasos.</w:t>
+              <w:t>Comprobaciones (10)</w:t>
             </w:r>
           </w:p>
         </w:tc>
-      </w:tr>
-      <w:tr>
         <w:tc>
           <w:tcPr>
-            <w:tcW w:type="dxa" w:w="1871"/>
+            <w:tcW w:type="dxa" w:w="3628"/>
           </w:tcPr>
           <w:p>
             <w:r/>
@@ -809,13 +706,13 @@
                 <w:b w:val="0"/>
                 <w:sz w:val="18"/>
               </w:rPr>
-              <w:t>En REST Assured</w:t>
+              <w:t>Pestaña Tests: pm.test(...)</w:t>
             </w:r>
           </w:p>
         </w:tc>
         <w:tc>
           <w:tcPr>
-            <w:tcW w:type="dxa" w:w="3742"/>
+            <w:tcW w:type="dxa" w:w="3855"/>
           </w:tcPr>
           <w:p>
             <w:r/>
@@ -824,13 +721,15 @@
                 <w:b w:val="0"/>
                 <w:sz w:val="18"/>
               </w:rPr>
-              <w:t>Clase ClientesApiVerificacionTest (4 tests).</w:t>
+              <w:t>.then(): statusCode, header, time y body(...)</w:t>
             </w:r>
           </w:p>
         </w:tc>
+      </w:tr>
+      <w:tr>
         <w:tc>
           <w:tcPr>
-            <w:tcW w:type="dxa" w:w="3912"/>
+            <w:tcW w:type="dxa" w:w="2041"/>
           </w:tcPr>
           <w:p>
             <w:r/>
@@ -839,7 +738,37 @@
                 <w:b w:val="0"/>
                 <w:sz w:val="18"/>
               </w:rPr>
-              <w:t>Clase ClientesApiValidacionTest (1 test con el escenario completo).</w:t>
+              <w:t>Limpieza</w:t>
+            </w:r>
+          </w:p>
+        </w:tc>
+        <w:tc>
+          <w:tcPr>
+            <w:tcW w:type="dxa" w:w="3628"/>
+          </w:tcPr>
+          <w:p>
+            <w:r/>
+            <w:r>
+              <w:rPr>
+                <w:b w:val="0"/>
+                <w:sz w:val="18"/>
+              </w:rPr>
+              <w:t>Al final del script de tests se borra el cliente de prueba.</w:t>
+            </w:r>
+          </w:p>
+        </w:tc>
+        <w:tc>
+          <w:tcPr>
+            <w:tcW w:type="dxa" w:w="3855"/>
+          </w:tcPr>
+          <w:p>
+            <w:r/>
+            <w:r>
+              <w:rPr>
+                <w:b w:val="0"/>
+                <w:sz w:val="18"/>
+              </w:rPr>
+              <w:t>@AfterEach: borra el cliente de prueba.</w:t>
             </w:r>
           </w:p>
         </w:tc>
@@ -849,6 +778,235 @@
       <w:pPr>
         <w:spacing w:after="40"/>
       </w:pPr>
+    </w:p>
+    <w:p>
+      <w:pPr>
+        <w:spacing w:after="40"/>
+      </w:pPr>
+      <w:r>
+        <w:rPr>
+          <w:b/>
+          <w:i w:val="0"/>
+        </w:rPr>
+        <w:t>Las 10 comprobaciones, idénticas en las dos:</w:t>
+      </w:r>
+    </w:p>
+    <w:p>
+      <w:pPr>
+        <w:pStyle w:val="ListBullet"/>
+        <w:spacing w:after="40"/>
+      </w:pPr>
+      <w:r>
+        <w:rPr>
+          <w:b w:val="0"/>
+        </w:rPr>
+        <w:t xml:space="preserve">Status </w:t>
+      </w:r>
+      <w:r>
+        <w:rPr>
+          <w:b/>
+        </w:rPr>
+        <w:t>201 Created</w:t>
+      </w:r>
+      <w:r>
+        <w:rPr>
+          <w:b w:val="0"/>
+        </w:rPr>
+        <w:t xml:space="preserve"> (se creó un recurso nuevo).</w:t>
+      </w:r>
+    </w:p>
+    <w:p>
+      <w:pPr>
+        <w:pStyle w:val="ListBullet"/>
+        <w:spacing w:after="40"/>
+      </w:pPr>
+      <w:r>
+        <w:rPr>
+          <w:b w:val="0"/>
+        </w:rPr>
+        <w:t xml:space="preserve">Cabecera </w:t>
+      </w:r>
+      <w:r>
+        <w:rPr>
+          <w:b/>
+        </w:rPr>
+        <w:t>Content-Type: application/json</w:t>
+      </w:r>
+      <w:r>
+        <w:rPr>
+          <w:b w:val="0"/>
+        </w:rPr>
+        <w:t>.</w:t>
+      </w:r>
+    </w:p>
+    <w:p>
+      <w:pPr>
+        <w:pStyle w:val="ListBullet"/>
+        <w:spacing w:after="40"/>
+      </w:pPr>
+      <w:r>
+        <w:rPr>
+          <w:b w:val="0"/>
+        </w:rPr>
+        <w:t xml:space="preserve">Responde en </w:t>
+      </w:r>
+      <w:r>
+        <w:rPr>
+          <w:b/>
+        </w:rPr>
+        <w:t>menos de 3 segundos</w:t>
+      </w:r>
+      <w:r>
+        <w:rPr>
+          <w:b w:val="0"/>
+        </w:rPr>
+        <w:t>.</w:t>
+      </w:r>
+    </w:p>
+    <w:p>
+      <w:pPr>
+        <w:pStyle w:val="ListBullet"/>
+        <w:spacing w:after="40"/>
+      </w:pPr>
+      <w:r>
+        <w:rPr>
+          <w:b w:val="0"/>
+        </w:rPr>
+        <w:t xml:space="preserve">La respuesta trae </w:t>
+      </w:r>
+      <w:r>
+        <w:rPr>
+          <w:b/>
+        </w:rPr>
+        <w:t>id_cliente</w:t>
+      </w:r>
+      <w:r>
+        <w:rPr>
+          <w:b w:val="0"/>
+        </w:rPr>
+        <w:t xml:space="preserve"> (el cliente se creó).</w:t>
+      </w:r>
+    </w:p>
+    <w:p>
+      <w:pPr>
+        <w:pStyle w:val="ListBullet"/>
+        <w:spacing w:after="40"/>
+      </w:pPr>
+      <w:r>
+        <w:rPr>
+          <w:b/>
+        </w:rPr>
+        <w:t>razonSocial</w:t>
+      </w:r>
+      <w:r>
+        <w:rPr>
+          <w:b w:val="0"/>
+        </w:rPr>
+        <w:t xml:space="preserve"> = "Cliente API " + documento.</w:t>
+      </w:r>
+    </w:p>
+    <w:p>
+      <w:pPr>
+        <w:pStyle w:val="ListBullet"/>
+        <w:spacing w:after="40"/>
+      </w:pPr>
+      <w:r>
+        <w:rPr>
+          <w:b/>
+        </w:rPr>
+        <w:t>estado</w:t>
+      </w:r>
+      <w:r>
+        <w:rPr>
+          <w:b w:val="0"/>
+        </w:rPr>
+        <w:t xml:space="preserve"> = "Activo".</w:t>
+      </w:r>
+    </w:p>
+    <w:p>
+      <w:pPr>
+        <w:pStyle w:val="ListBullet"/>
+        <w:spacing w:after="40"/>
+      </w:pPr>
+      <w:r>
+        <w:rPr>
+          <w:b/>
+        </w:rPr>
+        <w:t>condicionDePago</w:t>
+      </w:r>
+      <w:r>
+        <w:rPr>
+          <w:b w:val="0"/>
+        </w:rPr>
+        <w:t xml:space="preserve"> = "Cuenta corriente".</w:t>
+      </w:r>
+    </w:p>
+    <w:p>
+      <w:pPr>
+        <w:pStyle w:val="ListBullet"/>
+        <w:spacing w:after="40"/>
+      </w:pPr>
+      <w:r>
+        <w:rPr>
+          <w:b/>
+        </w:rPr>
+        <w:t>limiteCredito</w:t>
+      </w:r>
+      <w:r>
+        <w:rPr>
+          <w:b w:val="0"/>
+        </w:rPr>
+        <w:t xml:space="preserve"> = 15000.</w:t>
+      </w:r>
+    </w:p>
+    <w:p>
+      <w:pPr>
+        <w:pStyle w:val="ListBullet"/>
+        <w:spacing w:after="40"/>
+      </w:pPr>
+      <w:r>
+        <w:rPr>
+          <w:b/>
+        </w:rPr>
+        <w:t>saldoDeudor</w:t>
+      </w:r>
+      <w:r>
+        <w:rPr>
+          <w:b w:val="0"/>
+        </w:rPr>
+        <w:t xml:space="preserve"> = 0 (arranca sin deuda).</w:t>
+      </w:r>
+    </w:p>
+    <w:p>
+      <w:pPr>
+        <w:pStyle w:val="ListBullet"/>
+        <w:spacing w:after="40"/>
+      </w:pPr>
+      <w:r>
+        <w:rPr>
+          <w:b/>
+        </w:rPr>
+        <w:t>persona.numeroDocumento</w:t>
+      </w:r>
+      <w:r>
+        <w:rPr>
+          <w:b w:val="0"/>
+        </w:rPr>
+        <w:t xml:space="preserve"> = el documento enviado.</w:t>
+      </w:r>
+    </w:p>
+    <w:p>
+      <w:pPr>
+        <w:spacing w:after="80"/>
+      </w:pPr>
+      <w:r>
+        <w:rPr>
+          <w:b w:val="0"/>
+          <w:i/>
+          <w:color w:val="555555"/>
+        </w:rPr>
+        <w:t>El documento se genera al azar en cada corrida, así el cliente nunca se repite. Y como al final se borra, la prueba se puede correr en local o contra la app publicada sin dejar datos.</w:t>
+      </w:r>
     </w:p>
     <w:p>
       <w:pPr>
@@ -874,7 +1032,7 @@
           <w:b w:val="0"/>
           <w:i w:val="0"/>
         </w:rPr>
-        <w:t xml:space="preserve"> Hace lo mismo que Postman (manda peticiones HTTP y revisa las respuestas), pero en vez de botones y formularios, la prueba es una clase Java que vive en el proyecto, al lado del código que prueba.</w:t>
+        <w:t xml:space="preserve"> Hace lo mismo que Postman (manda la petición HTTP y revisa la respuesta), pero en vez de botones y formularios, la prueba es una clase Java que vive en el proyecto, al lado del código que prueba.</w:t>
       </w:r>
     </w:p>
     <w:p>
@@ -886,7 +1044,7 @@
         <w:rPr>
           <w:b w:val="0"/>
         </w:rPr>
-        <w:t xml:space="preserve">Se usa junto con </w:t>
+        <w:t xml:space="preserve">Se usa con </w:t>
       </w:r>
       <w:r>
         <w:rPr>
@@ -898,7 +1056,7 @@
         <w:rPr>
           <w:b w:val="0"/>
         </w:rPr>
-        <w:t>, el framework de tests de Java: cada método con @Test es una prueba, y el IDE la marca en verde o en rojo.</w:t>
+        <w:t>, el framework de tests de Java: el método con @Test es la prueba y el IDE la marca en verde o en rojo.</w:t>
       </w:r>
     </w:p>
     <w:p>
@@ -946,7 +1104,7 @@
         <w:rPr>
           <w:b w:val="0"/>
         </w:rPr>
-        <w:t xml:space="preserve"> = la acción (el POST, GET, PUT o DELETE); </w:t>
+        <w:t xml:space="preserve"> = la acción (el POST); </w:t>
       </w:r>
       <w:r>
         <w:rPr>
@@ -958,7 +1116,7 @@
         <w:rPr>
           <w:b w:val="0"/>
         </w:rPr>
-        <w:t xml:space="preserve"> = lo que espero (código de estado, campos del JSON, tiempo de respuesta).</w:t>
+        <w:t xml:space="preserve"> = lo que espero (código de estado, cabeceras, campos del JSON, tiempo de respuesta).</w:t>
       </w:r>
     </w:p>
     <w:p>
@@ -970,7 +1128,7 @@
         <w:rPr>
           <w:b w:val="0"/>
         </w:rPr>
-        <w:t xml:space="preserve">Las comprobaciones sobre el JSON se escriben con </w:t>
+        <w:t xml:space="preserve">Las comprobaciones se escriben con </w:t>
       </w:r>
       <w:r>
         <w:rPr>
@@ -982,7 +1140,7 @@
         <w:rPr>
           <w:b w:val="0"/>
         </w:rPr>
-        <w:t>: equalTo(...) es "igual a", notNullValue() es "que exista", containsString(...) es "que contenga".</w:t>
+        <w:t>: equalTo(...) es "igual a", notNullValue() es "que exista", lessThan(...) es "menor que".</w:t>
       </w:r>
     </w:p>
     <w:p>
@@ -1042,7 +1200,7 @@
         <w:rPr>
           <w:b w:val="0"/>
         </w:rPr>
-        <w:t xml:space="preserve"> junto con los otros 356 tests del backend. Si alguien rompe el alta de clientes, el build falla.</w:t>
+        <w:t xml:space="preserve"> junto con el resto de los tests del backend. Si alguien rompe el alta de clientes, el build falla.</w:t>
       </w:r>
     </w:p>
     <w:p>
@@ -1061,7 +1219,7 @@
           <w:b/>
           <w:i w:val="0"/>
         </w:rPr>
-        <w:t>Postman es para probar la API a mano y explorarla; REST Assured es para dejar esa misma prueba automatizada dentro del proyecto.</w:t>
+        <w:t>Postman es para probar la API a mano; REST Assured deja esa misma prueba automatizada dentro del proyecto.</w:t>
       </w:r>
     </w:p>
     <w:tbl>
@@ -1088,7 +1246,7 @@
                 <w:rFonts w:ascii="Consolas" w:hAnsi="Consolas" w:eastAsia="Consolas"/>
                 <w:sz w:val="17"/>
               </w:rPr>
-              <w:t>given()                                      // preparo</w:t>
+              <w:t>given()                                                  // preparo</w:t>
             </w:r>
           </w:p>
           <w:p>
@@ -1124,7 +1282,7 @@
                 <w:rFonts w:ascii="Consolas" w:hAnsi="Consolas" w:eastAsia="Consolas"/>
                 <w:sz w:val="17"/>
               </w:rPr>
-              <w:t xml:space="preserve">    .body(cliente(documento, 10000))</w:t>
+              <w:t xml:space="preserve">    .body(Map.of("razonSocial", "Cliente API " + documento, ...))</w:t>
             </w:r>
           </w:p>
           <w:p>
@@ -1136,7 +1294,7 @@
                 <w:rFonts w:ascii="Consolas" w:hAnsi="Consolas" w:eastAsia="Consolas"/>
                 <w:sz w:val="17"/>
               </w:rPr>
-              <w:t>.when()                                      // ejecuto</w:t>
+              <w:t>.when()                                                  // ejecuto</w:t>
             </w:r>
           </w:p>
           <w:p>
@@ -1160,7 +1318,7 @@
                 <w:rFonts w:ascii="Consolas" w:hAnsi="Consolas" w:eastAsia="Consolas"/>
                 <w:sz w:val="17"/>
               </w:rPr>
-              <w:t>.then()                                      // verifico</w:t>
+              <w:t>.then()                                                  // verifico</w:t>
             </w:r>
           </w:p>
           <w:p>
@@ -1172,7 +1330,7 @@
                 <w:rFonts w:ascii="Consolas" w:hAnsi="Consolas" w:eastAsia="Consolas"/>
                 <w:sz w:val="17"/>
               </w:rPr>
-              <w:t xml:space="preserve">    .statusCode(200)</w:t>
+              <w:t xml:space="preserve">    .statusCode(201)</w:t>
             </w:r>
           </w:p>
           <w:p>
@@ -1184,7 +1342,43 @@
                 <w:rFonts w:ascii="Consolas" w:hAnsi="Consolas" w:eastAsia="Consolas"/>
                 <w:sz w:val="17"/>
               </w:rPr>
-              <w:t xml:space="preserve">    .body("razonSocial", equalTo("Cliente API " + documento));</w:t>
+              <w:t xml:space="preserve">    .header("Content-Type", containsString("application/json"))</w:t>
+            </w:r>
+          </w:p>
+          <w:p>
+            <w:pPr>
+              <w:spacing w:after="0"/>
+            </w:pPr>
+            <w:r>
+              <w:rPr>
+                <w:rFonts w:ascii="Consolas" w:hAnsi="Consolas" w:eastAsia="Consolas"/>
+                <w:sz w:val="17"/>
+              </w:rPr>
+              <w:t xml:space="preserve">    .time(lessThan(3000L))</w:t>
+            </w:r>
+          </w:p>
+          <w:p>
+            <w:pPr>
+              <w:spacing w:after="0"/>
+            </w:pPr>
+            <w:r>
+              <w:rPr>
+                <w:rFonts w:ascii="Consolas" w:hAnsi="Consolas" w:eastAsia="Consolas"/>
+                <w:sz w:val="17"/>
+              </w:rPr>
+              <w:t xml:space="preserve">    .body("estado", equalTo("Activo"))</w:t>
+            </w:r>
+          </w:p>
+          <w:p>
+            <w:pPr>
+              <w:spacing w:after="0"/>
+            </w:pPr>
+            <w:r>
+              <w:rPr>
+                <w:rFonts w:ascii="Consolas" w:hAnsi="Consolas" w:eastAsia="Consolas"/>
+                <w:sz w:val="17"/>
+              </w:rPr>
+              <w:t xml:space="preserve">    .body("limiteCredito", monto(15000));</w:t>
             </w:r>
           </w:p>
         </w:tc>
@@ -1200,7 +1394,7 @@
         <w:pStyle w:val="Heading1"/>
       </w:pPr>
       <w:r>
-        <w:t>4. Lo que preparamos en el repositorio</w:t>
+        <w:t>4. Lo que preparamos y cómo dejarlo listo</w:t>
       </w:r>
     </w:p>
     <w:tbl>
@@ -1217,7 +1411,7 @@
       <w:tr>
         <w:tc>
           <w:tcPr>
-            <w:tcW w:type="dxa" w:w="4649"/>
+            <w:tcW w:type="dxa" w:w="4876"/>
             <w:shd w:val="clear" w:fill="5B3FA8"/>
           </w:tcPr>
           <w:p>
@@ -1234,7 +1428,7 @@
         </w:tc>
         <w:tc>
           <w:tcPr>
-            <w:tcW w:type="dxa" w:w="4876"/>
+            <w:tcW w:type="dxa" w:w="4649"/>
             <w:shd w:val="clear" w:fill="5B3FA8"/>
           </w:tcPr>
           <w:p>
@@ -1253,6 +1447,21 @@
       <w:tr>
         <w:tc>
           <w:tcPr>
+            <w:tcW w:type="dxa" w:w="4876"/>
+          </w:tcPr>
+          <w:p>
+            <w:r/>
+            <w:r>
+              <w:rPr>
+                <w:b w:val="0"/>
+                <w:sz w:val="18"/>
+              </w:rPr>
+              <w:t>Backend/sistema-gestion-elsur/src/test/java/com/elsur/sistema_gestion/api/RegistrarClienteRestAssuredTest.java</w:t>
+            </w:r>
+          </w:p>
+        </w:tc>
+        <w:tc>
+          <w:tcPr>
             <w:tcW w:type="dxa" w:w="4649"/>
           </w:tcPr>
           <w:p>
@@ -1262,10 +1471,12 @@
                 <w:b w:val="0"/>
                 <w:sz w:val="18"/>
               </w:rPr>
-              <w:t>src/test/java/com/elsur/sistema_gestion/api/ClientesApiVerificacionTest.java</w:t>
+              <w:t>El caso en REST Assured + JUnit 5.</w:t>
             </w:r>
           </w:p>
         </w:tc>
+      </w:tr>
+      <w:tr>
         <w:tc>
           <w:tcPr>
             <w:tcW w:type="dxa" w:w="4876"/>
@@ -1277,12 +1488,10 @@
                 <w:b w:val="0"/>
                 <w:sz w:val="18"/>
               </w:rPr>
-              <w:t>Verificación en REST Assured: los 4 casos del contrato (200, 409, 400, 401).</w:t>
+              <w:t>.../api/UsuarioApiPruebaInicializador.java</w:t>
             </w:r>
           </w:p>
         </w:tc>
-      </w:tr>
-      <w:tr>
         <w:tc>
           <w:tcPr>
             <w:tcW w:type="dxa" w:w="4649"/>
@@ -1294,22 +1503,7 @@
                 <w:b w:val="0"/>
                 <w:sz w:val="18"/>
               </w:rPr>
-              <w:t>src/test/java/com/elsur/sistema_gestion/api/ClientesApiValidacionTest.java</w:t>
-            </w:r>
-          </w:p>
-        </w:tc>
-        <w:tc>
-          <w:tcPr>
-            <w:tcW w:type="dxa" w:w="4876"/>
-          </w:tcPr>
-          <w:p>
-            <w:r/>
-            <w:r>
-              <w:rPr>
-                <w:b w:val="0"/>
-                <w:sz w:val="18"/>
-              </w:rPr>
-              <w:t>Validación en REST Assured: el escenario de la historia de usuario, que se limpia solo al final.</w:t>
+              <w:t>Crea el usuario de prueba admin.api / ApiTest2026 (solo existe en test, nunca en producción).</w:t>
             </w:r>
           </w:p>
         </w:tc>
@@ -1317,71 +1511,7 @@
       <w:tr>
         <w:tc>
           <w:tcPr>
-            <w:tcW w:type="dxa" w:w="4649"/>
-          </w:tcPr>
-          <w:p>
-            <w:r/>
-            <w:r>
-              <w:rPr>
-                <w:b w:val="0"/>
-                <w:sz w:val="18"/>
-              </w:rPr>
-              <w:t>src/test/java/com/elsur/sistema_gestion/api/ApiPruebaBase.java</w:t>
-            </w:r>
-          </w:p>
-        </w:tc>
-        <w:tc>
-          <w:tcPr>
             <w:tcW w:type="dxa" w:w="4876"/>
-          </w:tcPr>
-          <w:p>
-            <w:r/>
-            <w:r>
-              <w:rPr>
-                <w:b w:val="0"/>
-                <w:sz w:val="18"/>
-              </w:rPr>
-              <w:t>Lo común: levanta el backend, hace el login y arma el JSON del cliente (el mismo que en Postman).</w:t>
-            </w:r>
-          </w:p>
-        </w:tc>
-      </w:tr>
-      <w:tr>
-        <w:tc>
-          <w:tcPr>
-            <w:tcW w:type="dxa" w:w="4649"/>
-          </w:tcPr>
-          <w:p>
-            <w:r/>
-            <w:r>
-              <w:rPr>
-                <w:b w:val="0"/>
-                <w:sz w:val="18"/>
-              </w:rPr>
-              <w:t>src/test/java/com/elsur/sistema_gestion/api/UsuarioApiPruebaInicializador.java</w:t>
-            </w:r>
-          </w:p>
-        </w:tc>
-        <w:tc>
-          <w:tcPr>
-            <w:tcW w:type="dxa" w:w="4876"/>
-          </w:tcPr>
-          <w:p>
-            <w:r/>
-            <w:r>
-              <w:rPr>
-                <w:b w:val="0"/>
-                <w:sz w:val="18"/>
-              </w:rPr>
-              <w:t>Carga el usuario de prueba admin.api / ApiTest2026, el rol ADMIN y los tipos de documento. Solo existe en test y solo con el perfil "api".</w:t>
-            </w:r>
-          </w:p>
-        </w:tc>
-      </w:tr>
-      <w:tr>
-        <w:tc>
-          <w:tcPr>
-            <w:tcW w:type="dxa" w:w="4649"/>
           </w:tcPr>
           <w:p>
             <w:r/>
@@ -1396,7 +1526,7 @@
         </w:tc>
         <w:tc>
           <w:tcPr>
-            <w:tcW w:type="dxa" w:w="4876"/>
+            <w:tcW w:type="dxa" w:w="4649"/>
           </w:tcPr>
           <w:p>
             <w:r/>
@@ -1413,6 +1543,21 @@
       <w:tr>
         <w:tc>
           <w:tcPr>
+            <w:tcW w:type="dxa" w:w="4876"/>
+          </w:tcPr>
+          <w:p>
+            <w:r/>
+            <w:r>
+              <w:rPr>
+                <w:b w:val="0"/>
+                <w:sz w:val="18"/>
+              </w:rPr>
+              <w:t>docs/ie2/postman/GestaPro_Registrar_Cliente.postman_collection.json</w:t>
+            </w:r>
+          </w:p>
+        </w:tc>
+        <w:tc>
+          <w:tcPr>
             <w:tcW w:type="dxa" w:w="4649"/>
           </w:tcPr>
           <w:p>
@@ -1422,22 +1567,7 @@
                 <w:b w:val="0"/>
                 <w:sz w:val="18"/>
               </w:rPr>
-              <w:t>docs/ie2/postman/GestaPro_API_Clientes.postman_collection.json</w:t>
-            </w:r>
-          </w:p>
-        </w:tc>
-        <w:tc>
-          <w:tcPr>
-            <w:tcW w:type="dxa" w:w="4876"/>
-          </w:tcPr>
-          <w:p>
-            <w:r/>
-            <w:r>
-              <w:rPr>
-                <w:b w:val="0"/>
-                <w:sz w:val="18"/>
-              </w:rPr>
-              <w:t>La colección de Postman con las dos carpetas.</w:t>
+              <w:t>La colección de Postman con la única petición.</w:t>
             </w:r>
           </w:p>
         </w:tc>
@@ -1445,7 +1575,7 @@
       <w:tr>
         <w:tc>
           <w:tcPr>
-            <w:tcW w:type="dxa" w:w="4649"/>
+            <w:tcW w:type="dxa" w:w="4876"/>
           </w:tcPr>
           <w:p>
             <w:r/>
@@ -1460,7 +1590,7 @@
         </w:tc>
         <w:tc>
           <w:tcPr>
-            <w:tcW w:type="dxa" w:w="4876"/>
+            <w:tcW w:type="dxa" w:w="4649"/>
           </w:tcPr>
           <w:p>
             <w:r/>
@@ -1477,7 +1607,7 @@
       <w:tr>
         <w:tc>
           <w:tcPr>
-            <w:tcW w:type="dxa" w:w="4649"/>
+            <w:tcW w:type="dxa" w:w="4876"/>
           </w:tcPr>
           <w:p>
             <w:r/>
@@ -1492,7 +1622,7 @@
         </w:tc>
         <w:tc>
           <w:tcPr>
-            <w:tcW w:type="dxa" w:w="4876"/>
+            <w:tcW w:type="dxa" w:w="4649"/>
           </w:tcPr>
           <w:p>
             <w:r/>
@@ -1501,7 +1631,7 @@
                 <w:b w:val="0"/>
                 <w:sz w:val="18"/>
               </w:rPr>
-              <w:t>Entorno de la app publicada: https://sistema-gestion-elsur.onrender.com. El usuario y la contraseña los cargan ustedes (no están en el archivo).</w:t>
+              <w:t>Entorno de la app publicada (https://sistema-gestion-elsur.onrender.com, la que usa Vercel). Usuario y contraseña los cargan ustedes.</w:t>
             </w:r>
           </w:p>
         </w:tc>
@@ -1509,7 +1639,7 @@
       <w:tr>
         <w:tc>
           <w:tcPr>
-            <w:tcW w:type="dxa" w:w="4649"/>
+            <w:tcW w:type="dxa" w:w="4876"/>
           </w:tcPr>
           <w:p>
             <w:r/>
@@ -1524,7 +1654,7 @@
         </w:tc>
         <w:tc>
           <w:tcPr>
-            <w:tcW w:type="dxa" w:w="4876"/>
+            <w:tcW w:type="dxa" w:w="4649"/>
           </w:tcPr>
           <w:p>
             <w:r/>
@@ -1533,7 +1663,7 @@
                 <w:b w:val="0"/>
                 <w:sz w:val="18"/>
               </w:rPr>
-              <w:t>Levanta el backend local de prueba en http://localhost:8080 (base H2 en memoria). No toca Supabase.</w:t>
+              <w:t>Levanta el backend local de prueba en http://localhost:8080 (base en memoria). No toca Supabase.</w:t>
             </w:r>
           </w:p>
         </w:tc>
@@ -1549,7 +1679,103 @@
         <w:pStyle w:val="Heading2"/>
       </w:pPr>
       <w:r>
-        <w:t>Antes de la clase (checklist)</w:t>
+        <w:t>Antes de la clase</w:t>
+      </w:r>
+    </w:p>
+    <w:p>
+      <w:pPr>
+        <w:pStyle w:val="ListBullet"/>
+        <w:spacing w:after="40"/>
+      </w:pPr>
+      <w:r>
+        <w:rPr>
+          <w:b/>
+        </w:rPr>
+        <w:t>Postman:</w:t>
+      </w:r>
+      <w:r>
+        <w:rPr>
+          <w:b w:val="0"/>
+        </w:rPr>
+        <w:t xml:space="preserve"> Import → arrastrar los 3 archivos de docs/ie2/postman → Import. Arriba a la derecha elegir el entorno </w:t>
+      </w:r>
+      <w:r>
+        <w:rPr>
+          <w:b/>
+        </w:rPr>
+        <w:t>GestaPro - Local</w:t>
+      </w:r>
+      <w:r>
+        <w:rPr>
+          <w:b w:val="0"/>
+        </w:rPr>
+        <w:t>.</w:t>
+      </w:r>
+    </w:p>
+    <w:p>
+      <w:pPr>
+        <w:pStyle w:val="ListBullet"/>
+        <w:spacing w:after="40"/>
+      </w:pPr>
+      <w:r>
+        <w:rPr>
+          <w:b/>
+        </w:rPr>
+        <w:t>IntelliJ:</w:t>
+      </w:r>
+      <w:r>
+        <w:rPr>
+          <w:b w:val="0"/>
+        </w:rPr>
+        <w:t xml:space="preserve"> abrir Backend/sistema-gestion-elsur, ir a src/test/java/com/elsur/sistema_gestion/api y correr una vez RegistrarClienteRestAssuredTest (triángulo verde), para que se bajen las dependencias.</w:t>
+      </w:r>
+    </w:p>
+    <w:p>
+      <w:pPr>
+        <w:pStyle w:val="ListBullet"/>
+        <w:spacing w:after="40"/>
+      </w:pPr>
+      <w:r>
+        <w:rPr>
+          <w:b/>
+        </w:rPr>
+        <w:t>Backend local:</w:t>
+      </w:r>
+      <w:r>
+        <w:rPr>
+          <w:b w:val="0"/>
+        </w:rPr>
+        <w:t xml:space="preserve"> doble clic en docs/ie2/iniciar_backend_pruebas.cmd y esperar "[API de prueba] Usuario 'admin.api' listo".</w:t>
+      </w:r>
+    </w:p>
+    <w:p>
+      <w:pPr>
+        <w:pStyle w:val="ListBullet"/>
+        <w:spacing w:after="40"/>
+      </w:pPr>
+      <w:r>
+        <w:rPr>
+          <w:b/>
+        </w:rPr>
+        <w:t>Si quieren usar la app publicada:</w:t>
+      </w:r>
+      <w:r>
+        <w:rPr>
+          <w:b w:val="0"/>
+        </w:rPr>
+        <w:t xml:space="preserve"> en el entorno GestaPro - Publicado, cargar usuario y contraseña reales </w:t>
+      </w:r>
+      <w:r>
+        <w:rPr>
+          <w:b/>
+        </w:rPr>
+        <w:t>solo en "Current value"</w:t>
+      </w:r>
+      <w:r>
+        <w:rPr>
+          <w:b w:val="0"/>
+        </w:rPr>
+        <w:t xml:space="preserve"> (no se exportan ni se suben). Ese día, abrir la app de Vercel 5 minutos antes para despertar el servidor de Render (en el plan gratis tarda casi un minuto la primera vez).</w:t>
       </w:r>
     </w:p>
     <w:p>
@@ -1561,145 +1787,7 @@
         <w:rPr>
           <w:b w:val="0"/>
         </w:rPr>
-        <w:t xml:space="preserve">Instalar </w:t>
-      </w:r>
-      <w:r>
-        <w:rPr>
-          <w:b/>
-        </w:rPr>
-        <w:t>Postman</w:t>
-      </w:r>
-      <w:r>
-        <w:rPr>
-          <w:b w:val="0"/>
-        </w:rPr>
-        <w:t xml:space="preserve"> e importar los tres archivos de docs/ie2/postman (Import → arrastrar los archivos).</w:t>
-      </w:r>
-    </w:p>
-    <w:p>
-      <w:pPr>
-        <w:pStyle w:val="ListBullet"/>
-        <w:spacing w:after="40"/>
-      </w:pPr>
-      <w:r>
-        <w:rPr>
-          <w:b w:val="0"/>
-        </w:rPr>
-        <w:t xml:space="preserve">En el entorno </w:t>
-      </w:r>
-      <w:r>
-        <w:rPr>
-          <w:b/>
-        </w:rPr>
-        <w:t>"GestaPro - Publicado"</w:t>
-      </w:r>
-      <w:r>
-        <w:rPr>
-          <w:b w:val="0"/>
-        </w:rPr>
-        <w:t xml:space="preserve">, cargar el usuario y la contraseña reales de la app </w:t>
-      </w:r>
-      <w:r>
-        <w:rPr>
-          <w:b/>
-        </w:rPr>
-        <w:t>solo en la columna "Current value"</w:t>
-      </w:r>
-      <w:r>
-        <w:rPr>
-          <w:b w:val="0"/>
-        </w:rPr>
-        <w:t xml:space="preserve"> (así no se sincronizan ni se exportan). Nunca los suban al repo.</w:t>
-      </w:r>
-    </w:p>
-    <w:p>
-      <w:pPr>
-        <w:pStyle w:val="ListBullet"/>
-        <w:spacing w:after="40"/>
-      </w:pPr>
-      <w:r>
-        <w:rPr>
-          <w:b w:val="0"/>
-        </w:rPr>
-        <w:t xml:space="preserve">Abrir el backend en </w:t>
-      </w:r>
-      <w:r>
-        <w:rPr>
-          <w:b/>
-        </w:rPr>
-        <w:t>IntelliJ</w:t>
-      </w:r>
-      <w:r>
-        <w:rPr>
-          <w:b w:val="0"/>
-        </w:rPr>
-        <w:t xml:space="preserve"> y correr una vez las dos clases (botón verde) para que Maven baje las dependencias.</w:t>
-      </w:r>
-    </w:p>
-    <w:p>
-      <w:pPr>
-        <w:pStyle w:val="ListBullet"/>
-        <w:spacing w:after="40"/>
-      </w:pPr>
-      <w:r>
-        <w:rPr>
-          <w:b w:val="0"/>
-        </w:rPr>
-        <w:t xml:space="preserve">Probar </w:t>
-      </w:r>
-      <w:r>
-        <w:rPr>
-          <w:b/>
-        </w:rPr>
-        <w:t>docs/ie2/iniciar_backend_pruebas.cmd</w:t>
-      </w:r>
-      <w:r>
-        <w:rPr>
-          <w:b w:val="0"/>
-        </w:rPr>
-        <w:t xml:space="preserve"> (doble clic) y esperar "[API de prueba] Usuario 'admin.api' listo".</w:t>
-      </w:r>
-    </w:p>
-    <w:p>
-      <w:pPr>
-        <w:pStyle w:val="ListBullet"/>
-        <w:spacing w:after="40"/>
-      </w:pPr>
-      <w:r>
-        <w:rPr>
-          <w:b w:val="0"/>
-        </w:rPr>
-        <w:t>Correr la colección completa con el entorno Local, y la carpeta Validación con el entorno Publicado: todo en verde.</w:t>
-      </w:r>
-    </w:p>
-    <w:p>
-      <w:pPr>
-        <w:pStyle w:val="ListBullet"/>
-        <w:spacing w:after="40"/>
-      </w:pPr>
-      <w:r>
-        <w:rPr>
-          <w:b/>
-        </w:rPr>
-        <w:t>El día de la clase, 5 minutos antes:</w:t>
-      </w:r>
-      <w:r>
-        <w:rPr>
-          <w:b w:val="0"/>
-        </w:rPr>
-        <w:t xml:space="preserve"> abrir https://sistema-gestion-elsur.vercel.app (o https://sistema-gestion-elsur.onrender.com/actuator/health) para despertar el servidor de Render. En el plan gratuito se duerme y la primera petición puede tardar casi un minuto.</w:t>
-      </w:r>
-    </w:p>
-    <w:p>
-      <w:pPr>
-        <w:pStyle w:val="ListBullet"/>
-        <w:spacing w:after="40"/>
-      </w:pPr>
-      <w:r>
-        <w:rPr>
-          <w:b w:val="0"/>
-        </w:rPr>
-        <w:t>Subir la letra del IDE y de Postman para el proyector, y ensayar con cronómetro: los dos hablan.</w:t>
+        <w:t>Subir la letra de Postman y del IDE para el proyector y ensayar con cronómetro: hablan los dos.</w:t>
       </w:r>
     </w:p>
     <w:p>
@@ -2018,7 +2106,7 @@
                 <w:b w:val="0"/>
                 <w:sz w:val="18"/>
               </w:rPr>
-              <w:t>Si cambia el contrato, hay que actualizar cada petición a mano; los scripts se duplican.</w:t>
+              <w:t>Si cambia el contrato, hay que actualizar cada petición a mano.</w:t>
             </w:r>
           </w:p>
         </w:tc>
@@ -2040,7 +2128,7 @@
                 <w:b w:val="0"/>
                 <w:sz w:val="18"/>
               </w:rPr>
-              <w:t xml:space="preserve"> el JSON se arma con métodos reutilizables (cliente(...)) y el IDE avisa al refactorizar.</w:t>
+              <w:t xml:space="preserve"> el IDE avisa los errores al compilar y se puede reutilizar código.</w:t>
             </w:r>
           </w:p>
         </w:tc>
@@ -2148,7 +2236,7 @@
                 <w:b w:val="0"/>
                 <w:sz w:val="18"/>
               </w:rPr>
-              <w:t xml:space="preserve"> @SpringBootTest levanta la app con base en memoria; con -Dapi.url apunta a la publicada.</w:t>
+              <w:t xml:space="preserve"> @SpringBootTest levanta la app con base en memoria.</w:t>
             </w:r>
           </w:p>
         </w:tc>
@@ -2202,7 +2290,7 @@
                 <w:b w:val="0"/>
                 <w:sz w:val="18"/>
               </w:rPr>
-              <w:t xml:space="preserve"> mvn test la corre junto a los otros tests; un fallo corta el build.</w:t>
+              <w:t xml:space="preserve"> mvn test la corre con los demás tests; un fallo corta el build.</w:t>
             </w:r>
           </w:p>
         </w:tc>
@@ -2328,7 +2416,7 @@
                 <w:b w:val="0"/>
                 <w:sz w:val="18"/>
               </w:rPr>
-              <w:t>Probar a mano, explorar, documentar y validar rápido en la app publicada.</w:t>
+              <w:t>Probar a mano, explorar y documentar la API.</w:t>
             </w:r>
           </w:p>
         </w:tc>
@@ -2343,7 +2431,7 @@
                 <w:b w:val="0"/>
                 <w:sz w:val="18"/>
               </w:rPr>
-              <w:t>Regresión automática: que el contrato y el flujo no se rompan en cada cambio.</w:t>
+              <w:t>Regresión automática: que el contrato no se rompa en cada cambio.</w:t>
             </w:r>
           </w:p>
         </w:tc>
@@ -2370,7 +2458,7 @@
           <w:b w:val="0"/>
           <w:i w:val="0"/>
         </w:rPr>
-        <w:t xml:space="preserve"> no compiten, se complementan. Postman para explorar y validar rápido; REST Assured para dejar la verificación y la validación automatizadas dentro del proyecto, de modo que se repitan solas en cada build.</w:t>
+        <w:t xml:space="preserve"> no compiten, se complementan. Postman para explorar y probar a mano; REST Assured para dejar la prueba automatizada dentro del proyecto, de modo que se repita sola en cada build.</w:t>
       </w:r>
     </w:p>
     <w:p>
@@ -2495,7 +2583,7 @@
                 <w:b w:val="0"/>
                 <w:sz w:val="18"/>
               </w:rPr>
-              <w:t xml:space="preserve"> en El Sur, el Dueño da de alta a clientes habituales con cuenta corriente y un límite de crédito para venderles a cuenta. Por detrás, el frontend hace POST /api/clientes con el token del login. </w:t>
+              <w:t xml:space="preserve"> el Dueño registra a un cliente habitual con cuenta corriente y límite de $15.000; el frontend lo hace con POST /api/clientes y el token del login. </w:t>
             </w:r>
             <w:r>
               <w:rPr>
@@ -2509,35 +2597,7 @@
                 <w:b w:val="0"/>
                 <w:sz w:val="18"/>
               </w:rPr>
-              <w:t xml:space="preserve"> vamos a hacer las dos cosas con cada herramienta: </w:t>
-            </w:r>
-            <w:r>
-              <w:rPr>
-                <w:b/>
-                <w:sz w:val="18"/>
-              </w:rPr>
-              <w:t>Verificación</w:t>
-            </w:r>
-            <w:r>
-              <w:rPr>
-                <w:b w:val="0"/>
-                <w:sz w:val="18"/>
-              </w:rPr>
-              <w:t xml:space="preserve"> (¿la API cumple su contrato?) y </w:t>
-            </w:r>
-            <w:r>
-              <w:rPr>
-                <w:b/>
-                <w:sz w:val="18"/>
-              </w:rPr>
-              <w:t>Validación</w:t>
-            </w:r>
-            <w:r>
-              <w:rPr>
-                <w:b w:val="0"/>
-                <w:sz w:val="18"/>
-              </w:rPr>
-              <w:t xml:space="preserve"> (¿resuelve lo que necesita el Dueño, según los criterios de aceptación de las historias de usuario?). Presenta los criterios del mapa comparativo.</w:t>
+              <w:t xml:space="preserve"> es Verificación (¿el endpoint cumple su especificación?). Presenta los criterios del mapa comparativo.</w:t>
             </w:r>
           </w:p>
         </w:tc>
@@ -2591,7 +2651,7 @@
                 <w:b w:val="0"/>
                 <w:sz w:val="18"/>
               </w:rPr>
-              <w:t xml:space="preserve"> Carpeta Verificación con el entorno Local: login (se ve cómo se guarda el token), Crear cliente: pestañas </w:t>
+              <w:t xml:space="preserve"> Abre la petición "Registrar cliente": muestra la pestaña </w:t>
             </w:r>
             <w:r>
               <w:rPr>
@@ -2605,7 +2665,7 @@
                 <w:b w:val="0"/>
                 <w:sz w:val="18"/>
               </w:rPr>
-              <w:t xml:space="preserve"> (Authorization: Bearer …, Content-Type) y </w:t>
+              <w:t xml:space="preserve"> (Authorization: Bearer y Content-Type), la pestaña </w:t>
             </w:r>
             <w:r>
               <w:rPr>
@@ -2619,49 +2679,49 @@
                 <w:b w:val="0"/>
                 <w:sz w:val="18"/>
               </w:rPr>
-              <w:t xml:space="preserve"> (JSON) → Send → </w:t>
+              <w:t xml:space="preserve"> (el JSON del cliente) → </w:t>
             </w:r>
             <w:r>
               <w:rPr>
                 <w:b/>
                 <w:sz w:val="18"/>
               </w:rPr>
-              <w:t>200 OK</w:t>
+              <w:t>Send</w:t>
             </w:r>
             <w:r>
               <w:rPr>
                 <w:b w:val="0"/>
                 <w:sz w:val="18"/>
               </w:rPr>
-              <w:t xml:space="preserve">, tiempo y Test Results en verde. Después 409, 400 y 401. Luego cambia al entorno </w:t>
+              <w:t xml:space="preserve"> → muestra el </w:t>
             </w:r>
             <w:r>
               <w:rPr>
                 <w:b/>
                 <w:sz w:val="18"/>
               </w:rPr>
-              <w:t>Publicado</w:t>
+              <w:t>Status 201 Created</w:t>
             </w:r>
             <w:r>
               <w:rPr>
                 <w:b w:val="0"/>
                 <w:sz w:val="18"/>
               </w:rPr>
-              <w:t xml:space="preserve"> y corre la carpeta </w:t>
+              <w:t xml:space="preserve">, el tiempo, el JSON de respuesta (id_cliente, estado, límite) y </w:t>
             </w:r>
             <w:r>
               <w:rPr>
                 <w:b/>
                 <w:sz w:val="18"/>
               </w:rPr>
-              <w:t>Validación</w:t>
+              <w:t>Test Results</w:t>
             </w:r>
             <w:r>
               <w:rPr>
                 <w:b w:val="0"/>
                 <w:sz w:val="18"/>
               </w:rPr>
-              <w:t xml:space="preserve"> con el Runner: los 8 pasos contra la app real (la de Vercel) y el cliente de prueba se borra al final.</w:t>
+              <w:t xml:space="preserve"> con las 10 comprobaciones en verde. Cuenta que el login se hizo solo con el script de la colección y que al final se borró el cliente de prueba (se ve en la Console).</w:t>
             </w:r>
           </w:p>
         </w:tc>
@@ -2715,7 +2775,7 @@
                 <w:b w:val="0"/>
                 <w:sz w:val="18"/>
               </w:rPr>
-              <w:t xml:space="preserve"> Explica given / when / then con el test 1 de ClientesApiVerificacionTest y lo corre (4 en verde). Después corre ClientesApiValidacionTest: el mismo escenario del Dueño, escrito en Java, con los mismos pasos y la limpieza en el bloque finally.</w:t>
+              <w:t xml:space="preserve"> Abre RegistrarClienteRestAssuredTest y muestra que es el mismo caso: given (las mismas cabeceras y el mismo JSON), when (el mismo POST), then (las mismas 10 comprobaciones). Lo corre con el triángulo verde: el test levanta el backend y da verde.</w:t>
             </w:r>
           </w:p>
         </w:tc>
@@ -2762,14 +2822,14 @@
                 <w:b/>
                 <w:sz w:val="18"/>
               </w:rPr>
-              <w:t>Interpretación de resultados:</w:t>
+              <w:t>Lectura de resultados:</w:t>
             </w:r>
             <w:r>
               <w:rPr>
                 <w:b w:val="0"/>
                 <w:sz w:val="18"/>
               </w:rPr>
-              <w:t xml:space="preserve"> Lisandro lee el resumen del Runner (peticiones, tests pasados y tiempos; contra Render se notan tiempos más altos que en local). Lucas muestra el árbol de JUnit, la consola con las peticiones y respuestas, y el XML de target/surefire-reports. Opcional: romper una comprobación (por ejemplo, esperar 201) para ver cómo informa el error cada herramienta.</w:t>
+              <w:t xml:space="preserve"> Lisandro, el Test Results de Postman (y, si quieren, el Runner o Newman por consola). Lucas, el árbol de JUnit en verde y la consola con la petición y la respuesta (el token aparece oculto como [ BLACKLISTED ]). Opcional: cambiar el 201 por 200 en las dos para mostrar cómo informa el error cada una.</w:t>
             </w:r>
           </w:p>
         </w:tc>
@@ -2823,7 +2883,7 @@
                 <w:b w:val="0"/>
                 <w:sz w:val="18"/>
               </w:rPr>
-              <w:t xml:space="preserve"> facilidad de uso (Postman), mantenibilidad y versionado (REST Assured), integración en automatizaciones (mvn test vs. Newman). Valor para la calidad: la verificación protege el contrato en cada build y la validación confirma que el flujo del usuario sigue funcionando, incluso en la app publicada.</w:t>
+              <w:t xml:space="preserve"> facilidad de uso (Postman), mantenibilidad y versionado (REST Assured), integración en automatizaciones (mvn test vs. Newman). Valor para la calidad: el alta de clientes queda verificada en cada build y cualquier cambio que la rompa se detecta antes de llegar a producción.</w:t>
             </w:r>
           </w:p>
         </w:tc>
@@ -2871,7 +2931,7 @@
         <w:rPr>
           <w:b w:val="0"/>
         </w:rPr>
-        <w:t xml:space="preserve"> y esperar "[API de prueba] Usuario 'admin.api' listo" (unos 30 segundos).</w:t>
+        <w:t xml:space="preserve"> y esperar "[API de prueba] Usuario 'admin.api' listo" (unos 30 segundos). Si usan la app publicada, este paso no hace falta.</w:t>
       </w:r>
     </w:p>
     <w:p>
@@ -2883,25 +2943,49 @@
         <w:rPr>
           <w:b w:val="0"/>
         </w:rPr>
-        <w:t xml:space="preserve">Entorno </w:t>
+        <w:t xml:space="preserve">Elegir el entorno </w:t>
       </w:r>
       <w:r>
         <w:rPr>
           <w:b/>
         </w:rPr>
-        <w:t>GestaPro - Local (H2 de prueba)</w:t>
+        <w:t>GestaPro - Local</w:t>
       </w:r>
       <w:r>
         <w:rPr>
           <w:b w:val="0"/>
         </w:rPr>
-        <w:t xml:space="preserve"> arriba a la derecha. Desplegar la carpeta </w:t>
+        <w:t xml:space="preserve"> (o </w:t>
       </w:r>
       <w:r>
         <w:rPr>
           <w:b/>
         </w:rPr>
-        <w:t>1. Verificación</w:t>
+        <w:t>GestaPro - Publicado</w:t>
+      </w:r>
+      <w:r>
+        <w:rPr>
+          <w:b w:val="0"/>
+        </w:rPr>
+        <w:t>) arriba a la derecha.</w:t>
+      </w:r>
+    </w:p>
+    <w:p>
+      <w:pPr>
+        <w:pStyle w:val="ListNumber"/>
+        <w:spacing w:after="40"/>
+      </w:pPr>
+      <w:r>
+        <w:rPr>
+          <w:b w:val="0"/>
+        </w:rPr>
+        <w:t xml:space="preserve">Abrir la petición </w:t>
+      </w:r>
+      <w:r>
+        <w:rPr>
+          <w:b/>
+        </w:rPr>
+        <w:t>Registrar cliente (POST /api/clientes)</w:t>
       </w:r>
       <w:r>
         <w:rPr>
@@ -2917,33 +3001,45 @@
       </w:pPr>
       <w:r>
         <w:rPr>
+          <w:b w:val="0"/>
+        </w:rPr>
+        <w:t xml:space="preserve">Mostrar </w:t>
+      </w:r>
+      <w:r>
+        <w:rPr>
           <w:b/>
         </w:rPr>
-        <w:t>Login</w:t>
+        <w:t>Headers</w:t>
       </w:r>
       <w:r>
         <w:rPr>
           <w:b w:val="0"/>
         </w:rPr>
-        <w:t xml:space="preserve"> → Send → 200 y token. En la pestaña Scripts/Tests se ve cómo se guarda en {{token}}.</w:t>
+        <w:t xml:space="preserve"> y </w:t>
       </w:r>
-    </w:p>
-    <w:p>
-      <w:pPr>
-        <w:pStyle w:val="ListNumber"/>
-        <w:spacing w:after="40"/>
-      </w:pPr>
       <w:r>
         <w:rPr>
           <w:b/>
         </w:rPr>
-        <w:t>1. Crear cliente</w:t>
+        <w:t>Body</w:t>
       </w:r>
       <w:r>
         <w:rPr>
           <w:b w:val="0"/>
         </w:rPr>
-        <w:t xml:space="preserve"> → mostrar Headers y Body → Send → Status, Time, Body de respuesta y Test Results.</w:t>
+        <w:t xml:space="preserve"> → </w:t>
+      </w:r>
+      <w:r>
+        <w:rPr>
+          <w:b/>
+        </w:rPr>
+        <w:t>Send</w:t>
+      </w:r>
+      <w:r>
+        <w:rPr>
+          <w:b w:val="0"/>
+        </w:rPr>
+        <w:t>.</w:t>
       </w:r>
     </w:p>
     <w:p>
@@ -2955,43 +3051,43 @@
         <w:rPr>
           <w:b w:val="0"/>
         </w:rPr>
-        <w:t xml:space="preserve">Peticiones </w:t>
+        <w:t xml:space="preserve">Mostrar </w:t>
       </w:r>
       <w:r>
         <w:rPr>
           <w:b/>
         </w:rPr>
-        <w:t>2</w:t>
+        <w:t>Status 201 Created</w:t>
       </w:r>
       <w:r>
         <w:rPr>
           <w:b w:val="0"/>
         </w:rPr>
-        <w:t xml:space="preserve">, </w:t>
+        <w:t xml:space="preserve">, el tiempo, el </w:t>
       </w:r>
       <w:r>
         <w:rPr>
           <w:b/>
         </w:rPr>
-        <w:t>3</w:t>
+        <w:t>Body</w:t>
       </w:r>
       <w:r>
         <w:rPr>
           <w:b w:val="0"/>
         </w:rPr>
-        <w:t xml:space="preserve"> y </w:t>
+        <w:t xml:space="preserve"> de la respuesta y </w:t>
       </w:r>
       <w:r>
         <w:rPr>
           <w:b/>
         </w:rPr>
-        <w:t>4</w:t>
+        <w:t>Test Results</w:t>
       </w:r>
       <w:r>
         <w:rPr>
           <w:b w:val="0"/>
         </w:rPr>
-        <w:t xml:space="preserve"> → 409, 400 y 401.</w:t>
+        <w:t xml:space="preserve"> (10 en verde).</w:t>
       </w:r>
     </w:p>
     <w:p>
@@ -3003,43 +3099,19 @@
         <w:rPr>
           <w:b w:val="0"/>
         </w:rPr>
-        <w:t xml:space="preserve">Cambiar al entorno </w:t>
+        <w:t xml:space="preserve">(Opcional) Abrir la </w:t>
       </w:r>
       <w:r>
         <w:rPr>
           <w:b/>
         </w:rPr>
-        <w:t>GestaPro - Publicado (Render / Vercel)</w:t>
+        <w:t>Console</w:t>
       </w:r>
       <w:r>
         <w:rPr>
           <w:b w:val="0"/>
         </w:rPr>
-        <w:t xml:space="preserve">. Clic derecho en la carpeta </w:t>
-      </w:r>
-      <w:r>
-        <w:rPr>
-          <w:b/>
-        </w:rPr>
-        <w:t>2. Validación</w:t>
-      </w:r>
-      <w:r>
-        <w:rPr>
-          <w:b w:val="0"/>
-        </w:rPr>
-        <w:t xml:space="preserve"> → </w:t>
-      </w:r>
-      <w:r>
-        <w:rPr>
-          <w:b/>
-        </w:rPr>
-        <w:t>Run folder</w:t>
-      </w:r>
-      <w:r>
-        <w:rPr>
-          <w:b w:val="0"/>
-        </w:rPr>
-        <w:t xml:space="preserve"> → Run: los 8 pasos en verde contra la app real.</w:t>
+        <w:t xml:space="preserve"> (abajo a la izquierda) para ver el login automático y la limpieza.</w:t>
       </w:r>
     </w:p>
     <w:p>
@@ -3051,13 +3123,13 @@
         <w:rPr>
           <w:b w:val="0"/>
         </w:rPr>
-        <w:t xml:space="preserve">(Opcional, por consola) </w:t>
+        <w:t xml:space="preserve">(Opcional, automatización) En una terminal, desde docs/ie2/postman: </w:t>
       </w:r>
       <w:r>
         <w:rPr>
           <w:b/>
         </w:rPr>
-        <w:t>npx newman run GestaPro_API_Clientes.postman_collection.json -e GestaPro_Local.postman_environment.json</w:t>
+        <w:t>npx newman run GestaPro_Registrar_Cliente.postman_collection.json -e GestaPro_Local.postman_environment.json</w:t>
       </w:r>
     </w:p>
     <w:p>
@@ -3083,13 +3155,13 @@
         <w:rPr>
           <w:b/>
         </w:rPr>
-        <w:t>ClientesApiVerificacionTest</w:t>
+        <w:t>RegistrarClienteRestAssuredTest</w:t>
       </w:r>
       <w:r>
         <w:rPr>
           <w:b w:val="0"/>
         </w:rPr>
-        <w:t xml:space="preserve"> y explicar el test 1 (given / when / then).</w:t>
+        <w:t xml:space="preserve"> (src/test/java/com/elsur/sistema_gestion/api).</w:t>
       </w:r>
     </w:p>
     <w:p>
@@ -3101,7 +3173,19 @@
         <w:rPr>
           <w:b w:val="0"/>
         </w:rPr>
-        <w:t xml:space="preserve">Triángulo verde de la clase → </w:t>
+        <w:t>Recorrer given / when / then y compararlo con lo que se vio en Postman.</w:t>
+      </w:r>
+    </w:p>
+    <w:p>
+      <w:pPr>
+        <w:pStyle w:val="ListNumber"/>
+        <w:spacing w:after="40"/>
+      </w:pPr>
+      <w:r>
+        <w:rPr>
+          <w:b w:val="0"/>
+        </w:rPr>
+        <w:t xml:space="preserve">Triángulo verde al lado de la clase → </w:t>
       </w:r>
       <w:r>
         <w:rPr>
@@ -3113,7 +3197,7 @@
         <w:rPr>
           <w:b w:val="0"/>
         </w:rPr>
-        <w:t xml:space="preserve"> → 4 tests en verde. No hace falta el backend del paso 7.1: el test levanta el suyo.</w:t>
+        <w:t xml:space="preserve"> → test en verde. No hace falta el backend del paso 7.1: el test levanta el suyo.</w:t>
       </w:r>
     </w:p>
     <w:p>
@@ -3125,19 +3209,7 @@
         <w:rPr>
           <w:b w:val="0"/>
         </w:rPr>
-        <w:t xml:space="preserve">Abrir </w:t>
-      </w:r>
-      <w:r>
-        <w:rPr>
-          <w:b/>
-        </w:rPr>
-        <w:t>ClientesApiValidacionTest</w:t>
-      </w:r>
-      <w:r>
-        <w:rPr>
-          <w:b w:val="0"/>
-        </w:rPr>
-        <w:t xml:space="preserve"> → Run → el escenario completo en verde; en la consola se ven los 200, el PUT del límite, el DELETE y el 404 final.</w:t>
+        <w:t>Mostrar en la consola la petición (POST, cabeceras y JSON) y la respuesta (HTTP/1.1 201 y el JSON).</w:t>
       </w:r>
     </w:p>
     <w:p>
@@ -3149,7 +3221,25 @@
         <w:rPr>
           <w:b w:val="0"/>
         </w:rPr>
-        <w:t>(Opcional) Correr la validación contra la app publicada desde una terminal PowerShell en Backend/sistema-gestion-elsur:</w:t>
+        <w:t xml:space="preserve">(Opcional, automatización) Por consola desde Backend/sistema-gestion-elsur: </w:t>
+      </w:r>
+      <w:r>
+        <w:rPr>
+          <w:b/>
+        </w:rPr>
+        <w:t>mvnw.cmd test -Dtest=RegistrarClienteRestAssuredTest</w:t>
+      </w:r>
+    </w:p>
+    <w:p>
+      <w:pPr>
+        <w:spacing w:after="40"/>
+      </w:pPr>
+      <w:r>
+        <w:rPr>
+          <w:b w:val="0"/>
+          <w:i w:val="0"/>
+        </w:rPr>
+        <w:t>(Opcional) El mismo test contra la app publicada, desde PowerShell en Backend/sistema-gestion-elsur:</w:t>
       </w:r>
     </w:p>
     <w:tbl>
@@ -3188,170 +3278,7 @@
                 <w:rFonts w:ascii="Consolas" w:hAnsi="Consolas" w:eastAsia="Consolas"/>
                 <w:sz w:val="17"/>
               </w:rPr>
-              <w:t>.\mvnw.cmd test -Dtest=ClientesApiValidacionTest "-Dapi.url=https://sistema-gestion-elsur.onrender.com"</w:t>
-            </w:r>
-          </w:p>
-        </w:tc>
-      </w:tr>
-    </w:tbl>
-    <w:p>
-      <w:pPr>
-        <w:spacing w:after="40"/>
-      </w:pPr>
-    </w:p>
-    <w:p>
-      <w:pPr>
-        <w:spacing w:after="80"/>
-      </w:pPr>
-      <w:r>
-        <w:rPr>
-          <w:b w:val="0"/>
-          <w:i/>
-          <w:color w:val="555555"/>
-        </w:rPr>
-        <w:t>Las credenciales van en variables de entorno, nunca en el código. La Verificación nunca corre contra la app publicada, aunque se pase -Dapi.url.</w:t>
-      </w:r>
-    </w:p>
-    <w:p>
-      <w:pPr>
-        <w:pStyle w:val="Heading2"/>
-      </w:pPr>
-      <w:r>
-        <w:t>7.3 La misma comprobación en las dos herramientas</w:t>
-      </w:r>
-    </w:p>
-    <w:p>
-      <w:pPr>
-        <w:spacing w:after="40"/>
-      </w:pPr>
-      <w:r>
-        <w:rPr>
-          <w:b w:val="0"/>
-          <w:i w:val="0"/>
-        </w:rPr>
-        <w:t>Postman (pestaña Tests / Post-response):</w:t>
-      </w:r>
-    </w:p>
-    <w:tbl>
-      <w:tblPr>
-        <w:tblW w:type="auto" w:w="0"/>
-        <w:tblLook w:firstColumn="1" w:firstRow="1" w:lastColumn="0" w:lastRow="0" w:noHBand="0" w:noVBand="1" w:val="04A0"/>
-      </w:tblPr>
-      <w:tblGrid>
-        <w:gridCol w:w="9746"/>
-      </w:tblGrid>
-      <w:tr>
-        <w:tc>
-          <w:tcPr>
-            <w:tcW w:type="dxa" w:w="9746"/>
-            <w:shd w:val="clear" w:fill="F3F1F9"/>
-          </w:tcPr>
-          <w:p>
-            <w:pPr>
-              <w:spacing w:after="0"/>
-            </w:pPr>
-            <w:r/>
-            <w:r>
-              <w:rPr>
-                <w:rFonts w:ascii="Consolas" w:hAnsi="Consolas" w:eastAsia="Consolas"/>
-                <w:sz w:val="17"/>
-              </w:rPr>
-              <w:t>pm.test('Status 200 OK', () =&gt; pm.response.to.have.status(200));</w:t>
-            </w:r>
-          </w:p>
-          <w:p>
-            <w:pPr>
-              <w:spacing w:after="0"/>
-            </w:pPr>
-            <w:r>
-              <w:rPr>
-                <w:rFonts w:ascii="Consolas" w:hAnsi="Consolas" w:eastAsia="Consolas"/>
-                <w:sz w:val="17"/>
-              </w:rPr>
-              <w:t>const json = pm.response.json();</w:t>
-            </w:r>
-          </w:p>
-          <w:p>
-            <w:pPr>
-              <w:spacing w:after="0"/>
-            </w:pPr>
-            <w:r>
-              <w:rPr>
-                <w:rFonts w:ascii="Consolas" w:hAnsi="Consolas" w:eastAsia="Consolas"/>
-                <w:sz w:val="17"/>
-              </w:rPr>
-              <w:t>pm.test('Razón social correcta', () =&gt; pm.expect(json.razonSocial).to.eql('Cliente API ' + doc));</w:t>
-            </w:r>
-          </w:p>
-        </w:tc>
-      </w:tr>
-    </w:tbl>
-    <w:p>
-      <w:pPr>
-        <w:spacing w:after="40"/>
-      </w:pPr>
-    </w:p>
-    <w:p>
-      <w:pPr>
-        <w:spacing w:after="40"/>
-      </w:pPr>
-      <w:r>
-        <w:rPr>
-          <w:b w:val="0"/>
-          <w:i w:val="0"/>
-        </w:rPr>
-        <w:t>REST Assured:</w:t>
-      </w:r>
-    </w:p>
-    <w:tbl>
-      <w:tblPr>
-        <w:tblW w:type="auto" w:w="0"/>
-        <w:tblLook w:firstColumn="1" w:firstRow="1" w:lastColumn="0" w:lastRow="0" w:noHBand="0" w:noVBand="1" w:val="04A0"/>
-      </w:tblPr>
-      <w:tblGrid>
-        <w:gridCol w:w="9746"/>
-      </w:tblGrid>
-      <w:tr>
-        <w:tc>
-          <w:tcPr>
-            <w:tcW w:type="dxa" w:w="9746"/>
-            <w:shd w:val="clear" w:fill="F3F1F9"/>
-          </w:tcPr>
-          <w:p>
-            <w:pPr>
-              <w:spacing w:after="0"/>
-            </w:pPr>
-            <w:r/>
-            <w:r>
-              <w:rPr>
-                <w:rFonts w:ascii="Consolas" w:hAnsi="Consolas" w:eastAsia="Consolas"/>
-                <w:sz w:val="17"/>
-              </w:rPr>
-              <w:t>.then()</w:t>
-            </w:r>
-          </w:p>
-          <w:p>
-            <w:pPr>
-              <w:spacing w:after="0"/>
-            </w:pPr>
-            <w:r>
-              <w:rPr>
-                <w:rFonts w:ascii="Consolas" w:hAnsi="Consolas" w:eastAsia="Consolas"/>
-                <w:sz w:val="17"/>
-              </w:rPr>
-              <w:t xml:space="preserve">    .statusCode(200)</w:t>
-            </w:r>
-          </w:p>
-          <w:p>
-            <w:pPr>
-              <w:spacing w:after="0"/>
-            </w:pPr>
-            <w:r>
-              <w:rPr>
-                <w:rFonts w:ascii="Consolas" w:hAnsi="Consolas" w:eastAsia="Consolas"/>
-                <w:sz w:val="17"/>
-              </w:rPr>
-              <w:t xml:space="preserve">    .body("razonSocial", equalTo("Cliente API " + documento));</w:t>
+              <w:t>.\mvnw.cmd test -Dtest=RegistrarClienteRestAssuredTest "-Dapi.url=https://sistema-gestion-elsur.onrender.com"</w:t>
             </w:r>
           </w:p>
         </w:tc>
@@ -3429,6 +3356,70 @@
                 <w:b w:val="0"/>
                 <w:sz w:val="18"/>
               </w:rPr>
+              <w:t>Postman: "Could not get response"</w:t>
+            </w:r>
+          </w:p>
+        </w:tc>
+        <w:tc>
+          <w:tcPr>
+            <w:tcW w:type="dxa" w:w="6350"/>
+          </w:tcPr>
+          <w:p>
+            <w:r/>
+            <w:r>
+              <w:rPr>
+                <w:b w:val="0"/>
+                <w:sz w:val="18"/>
+              </w:rPr>
+              <w:t>El backend local no está levantado o todavía arranca: ejecutar iniciar_backend_pruebas.cmd y esperar el mensaje "listo".</w:t>
+            </w:r>
+          </w:p>
+        </w:tc>
+      </w:tr>
+      <w:tr>
+        <w:tc>
+          <w:tcPr>
+            <w:tcW w:type="dxa" w:w="3175"/>
+          </w:tcPr>
+          <w:p>
+            <w:r/>
+            <w:r>
+              <w:rPr>
+                <w:b w:val="0"/>
+                <w:sz w:val="18"/>
+              </w:rPr>
+              <w:t>401 Unauthorized en Postman</w:t>
+            </w:r>
+          </w:p>
+        </w:tc>
+        <w:tc>
+          <w:tcPr>
+            <w:tcW w:type="dxa" w:w="6350"/>
+          </w:tcPr>
+          <w:p>
+            <w:r/>
+            <w:r>
+              <w:rPr>
+                <w:b w:val="0"/>
+                <w:sz w:val="18"/>
+              </w:rPr>
+              <w:t>El login automático falló: revisar usuario y contraseña del entorno elegido (en Local: admin.api / ApiTest2026).</w:t>
+            </w:r>
+          </w:p>
+        </w:tc>
+      </w:tr>
+      <w:tr>
+        <w:tc>
+          <w:tcPr>
+            <w:tcW w:type="dxa" w:w="3175"/>
+          </w:tcPr>
+          <w:p>
+            <w:r/>
+            <w:r>
+              <w:rPr>
+                <w:b w:val="0"/>
+                <w:sz w:val="18"/>
+              </w:rPr>
               <w:t>La app publicada tarda o da timeout</w:t>
             </w:r>
           </w:p>
@@ -3444,7 +3435,7 @@
                 <w:b w:val="0"/>
                 <w:sz w:val="18"/>
               </w:rPr>
-              <w:t>Render estaba dormido: esperar un minuto y repetir (por eso conviene despertarlo antes). Si sigue sin responder, correr la Validación con el entorno Local: es el mismo escenario.</w:t>
+              <w:t>Render estaba dormido: esperar un minuto y repetir. Si no, usar el entorno Local: es el mismo caso.</w:t>
             </w:r>
           </w:p>
         </w:tc>
@@ -3476,39 +3467,7 @@
                 <w:b w:val="0"/>
                 <w:sz w:val="18"/>
               </w:rPr>
-              <w:t>Todo funciona local con H2: usar el entorno Local para las dos carpetas y no pasar -Dapi.url en REST Assured.</w:t>
-            </w:r>
-          </w:p>
-        </w:tc>
-      </w:tr>
-      <w:tr>
-        <w:tc>
-          <w:tcPr>
-            <w:tcW w:type="dxa" w:w="3175"/>
-          </w:tcPr>
-          <w:p>
-            <w:r/>
-            <w:r>
-              <w:rPr>
-                <w:b w:val="0"/>
-                <w:sz w:val="18"/>
-              </w:rPr>
-              <w:t>Postman: "Could not get response" en local</w:t>
-            </w:r>
-          </w:p>
-        </w:tc>
-        <w:tc>
-          <w:tcPr>
-            <w:tcW w:type="dxa" w:w="6350"/>
-          </w:tcPr>
-          <w:p>
-            <w:r/>
-            <w:r>
-              <w:rPr>
-                <w:b w:val="0"/>
-                <w:sz w:val="18"/>
-              </w:rPr>
-              <w:t>El backend de prueba no está levantado o todavía arranca: volver a ejecutar iniciar_backend_pruebas.cmd y esperar el mensaje "listo".</w:t>
+              <w:t>Usar el entorno Local; REST Assured funciona igual porque levanta su propio backend.</w:t>
             </w:r>
           </w:p>
         </w:tc>
@@ -3557,70 +3516,6 @@
                 <w:b w:val="0"/>
                 <w:sz w:val="18"/>
               </w:rPr>
-              <w:t>401 en las peticiones</w:t>
-            </w:r>
-          </w:p>
-        </w:tc>
-        <w:tc>
-          <w:tcPr>
-            <w:tcW w:type="dxa" w:w="6350"/>
-          </w:tcPr>
-          <w:p>
-            <w:r/>
-            <w:r>
-              <w:rPr>
-                <w:b w:val="0"/>
-                <w:sz w:val="18"/>
-              </w:rPr>
-              <w:t>Falta el token: correr primero el Login de esa carpeta. En el entorno Publicado, revisar usuario y contraseña.</w:t>
-            </w:r>
-          </w:p>
-        </w:tc>
-      </w:tr>
-      <w:tr>
-        <w:tc>
-          <w:tcPr>
-            <w:tcW w:type="dxa" w:w="3175"/>
-          </w:tcPr>
-          <w:p>
-            <w:r/>
-            <w:r>
-              <w:rPr>
-                <w:b w:val="0"/>
-                <w:sz w:val="18"/>
-              </w:rPr>
-              <w:t>Las peticiones de Verificación aparecen "omitidas"</w:t>
-            </w:r>
-          </w:p>
-        </w:tc>
-        <w:tc>
-          <w:tcPr>
-            <w:tcW w:type="dxa" w:w="6350"/>
-          </w:tcPr>
-          <w:p>
-            <w:r/>
-            <w:r>
-              <w:rPr>
-                <w:b w:val="0"/>
-                <w:sz w:val="18"/>
-              </w:rPr>
-              <w:t>Es el seguro: el entorno elegido no es local. Cambiar a GestaPro - Local.</w:t>
-            </w:r>
-          </w:p>
-        </w:tc>
-      </w:tr>
-      <w:tr>
-        <w:tc>
-          <w:tcPr>
-            <w:tcW w:type="dxa" w:w="3175"/>
-          </w:tcPr>
-          <w:p>
-            <w:r/>
-            <w:r>
-              <w:rPr>
-                <w:b w:val="0"/>
-                <w:sz w:val="18"/>
-              </w:rPr>
               <w:t>IntelliJ no encuentra dependencias</w:t>
             </w:r>
           </w:p>
@@ -3636,7 +3531,7 @@
                 <w:b w:val="0"/>
                 <w:sz w:val="18"/>
               </w:rPr>
-              <w:t>Usar la consola: mvnw.cmd test "-Dtest=ClientesApi*Test". Por eso conviene correrlo una vez antes de la clase.</w:t>
+              <w:t>Usar la consola: mvnw.cmd test -Dtest=RegistrarClienteRestAssuredTest. Por eso conviene correrlo una vez antes de la clase.</w:t>
             </w:r>
           </w:p>
         </w:tc>
@@ -3664,7 +3559,7 @@
           <w:b/>
           <w:i w:val="0"/>
         </w:rPr>
-        <w:t>¿Cuál es la diferencia entre las dos pruebas?</w:t>
+        <w:t>¿Por qué es Verificación y no Validación?</w:t>
       </w:r>
     </w:p>
     <w:p>
@@ -3676,7 +3571,7 @@
           <w:b w:val="0"/>
           <w:i w:val="0"/>
         </w:rPr>
-        <w:t>La de Verificación compara la API contra su especificación técnica (códigos, JSON, reglas). La de Validación recorre el flujo que necesita el usuario y lo compara contra los criterios de aceptación de sus historias de usuario.</w:t>
+        <w:t>Porque comparamos la respuesta del endpoint contra su especificación (status, cabeceras, JSON). No evaluamos con el usuario si la funcionalidad le resuelve su necesidad.</w:t>
       </w:r>
     </w:p>
     <w:p>
@@ -3688,7 +3583,7 @@
           <w:b/>
           <w:i w:val="0"/>
         </w:rPr>
-        <w:t>¿Por qué la Verificación no corre contra la app publicada?</w:t>
+        <w:t>¿Es exactamente el mismo caso en las dos?</w:t>
       </w:r>
     </w:p>
     <w:p>
@@ -3700,7 +3595,7 @@
           <w:b w:val="0"/>
           <w:i w:val="0"/>
         </w:rPr>
-        <w:t>Porque el caso 409 necesita crear un cliente repetido y esos clientes no se borran: ensuciaría la base real. La Validación sí, porque al final borra lo que creó y confirma con un 404 que no quedó nada.</w:t>
+        <w:t>Sí: el mismo POST, las mismas cabeceras, el mismo body JSON y las mismas 10 comprobaciones. Cambia solo cómo se escribe: formularios y JavaScript en Postman, Java en REST Assured.</w:t>
       </w:r>
     </w:p>
     <w:p>
@@ -3712,7 +3607,7 @@
           <w:b/>
           <w:i w:val="0"/>
         </w:rPr>
-        <w:t>¿Por qué el alta devuelve 200 y no 201?</w:t>
+        <w:t>¿Por qué 201 y no 200?</w:t>
       </w:r>
     </w:p>
     <w:p>
@@ -3724,7 +3619,7 @@
           <w:b w:val="0"/>
           <w:i w:val="0"/>
         </w:rPr>
-        <w:t>Es el contrato actual del controlador. El test verifica el comportamiento real; si un día devolviera 201, el test lo detectaría.</w:t>
+        <w:t>Por convención REST, un POST que crea un recurso responde 201 Created. En GestaPro, el mismo POST /api/clientes también modifica un cliente si el JSON trae el id, y en ese caso responde 200 OK. Si alguien cambiara el código de respuesta, el test lo detectaría.</w:t>
       </w:r>
     </w:p>
     <w:p>
@@ -3736,7 +3631,7 @@
           <w:b/>
           <w:i w:val="0"/>
         </w:rPr>
-        <w:t>¿Cuál es la diferencia entre 401 y 403?</w:t>
+        <w:t>¿De dónde sale el token?</w:t>
       </w:r>
     </w:p>
     <w:p>
@@ -3748,7 +3643,31 @@
           <w:b w:val="0"/>
           <w:i w:val="0"/>
         </w:rPr>
-        <w:t>401: no hay autenticación válida (sin token o token vencido). 403: el usuario está autenticado, pero su perfil no tiene permiso para ese módulo.</w:t>
+        <w:t>De un login previo (POST /api/usuarios/login). En Postman lo hace el script de la colección; en REST Assured, el @BeforeEach. Es preparación, no parte del caso.</w:t>
+      </w:r>
+    </w:p>
+    <w:p>
+      <w:pPr>
+        <w:spacing w:after="20"/>
+      </w:pPr>
+      <w:r>
+        <w:rPr>
+          <w:b/>
+          <w:i w:val="0"/>
+        </w:rPr>
+        <w:t>¿Por qué se borra el cliente al final?</w:t>
+      </w:r>
+    </w:p>
+    <w:p>
+      <w:pPr>
+        <w:spacing w:after="120"/>
+      </w:pPr>
+      <w:r>
+        <w:rPr>
+          <w:b w:val="0"/>
+          <w:i w:val="0"/>
+        </w:rPr>
+        <w:t>Para no dejar datos de prueba: así se puede repetir la prueba todas las veces que haga falta, incluso contra la app publicada.</w:t>
       </w:r>
     </w:p>
     <w:p>
@@ -3772,7 +3691,7 @@
           <w:b w:val="0"/>
           <w:i w:val="0"/>
         </w:rPr>
-        <w:t>No depende de que alguien deje el backend prendido ni de datos previos: se puede correr en cualquier máquina o en un pipeline de integración continua.</w:t>
+        <w:t>No depende de que alguien deje el backend prendido ni de datos previos: corre en cualquier máquina o en un pipeline de integración continua.</w:t>
       </w:r>
     </w:p>
     <w:p>
@@ -3808,7 +3727,7 @@
           <w:b/>
           <w:i w:val="0"/>
         </w:rPr>
-        <w:t>¿Dónde están las credenciales de producción?</w:t>
+        <w:t>¿Cuál es la diferencia entre 401 y 403?</w:t>
       </w:r>
     </w:p>
     <w:p>
@@ -3820,31 +3739,7 @@
           <w:b w:val="0"/>
           <w:i w:val="0"/>
         </w:rPr>
-        <w:t>En ningún archivo del repositorio: en Postman, en el "Current value" del entorno; en REST Assured, en variables de entorno (API_USUARIO y API_PASSWORD).</w:t>
-      </w:r>
-    </w:p>
-    <w:p>
-      <w:pPr>
-        <w:spacing w:after="20"/>
-      </w:pPr>
-      <w:r>
-        <w:rPr>
-          <w:b/>
-          <w:i w:val="0"/>
-        </w:rPr>
-        <w:t>¿Qué es given / when / then?</w:t>
-      </w:r>
-    </w:p>
-    <w:p>
-      <w:pPr>
-        <w:spacing w:after="120"/>
-      </w:pPr>
-      <w:r>
-        <w:rPr>
-          <w:b w:val="0"/>
-          <w:i w:val="0"/>
-        </w:rPr>
-        <w:t>Estilo BDD: given = precondiciones (headers, body, token); when = la acción (POST, GET, PUT, DELETE); then = las comprobaciones (status, JSON, tiempo).</w:t>
+        <w:t>401: no hay autenticación válida (sin token o token vencido). 403: el usuario está autenticado, pero su perfil no tiene permiso para ese módulo.</w:t>
       </w:r>
     </w:p>
     <w:p>
@@ -4099,7 +3994,7 @@
                 <w:b w:val="0"/>
                 <w:sz w:val="18"/>
               </w:rPr>
-              <w:t>GET de una lista; en GestaPro, también el alta de cliente.</w:t>
+              <w:t>GET de una lista; en GestaPro, modificar un cliente.</w:t>
             </w:r>
           </w:p>
         </w:tc>
@@ -4146,7 +4041,7 @@
                 <w:b w:val="0"/>
                 <w:sz w:val="18"/>
               </w:rPr>
-              <w:t>POST que crea (convención REST).</w:t>
+              <w:t>POST que crea: el alta de cliente en GestaPro (nuestro caso).</w:t>
             </w:r>
           </w:p>
         </w:tc>

</xml_diff>

<commit_message>
Postman con todo en una sola peticion, test de REST Assured comentado y mapa comparativo
- La peticion de Postman incluye el login (Scripts > Pre-request), las cabeceras,
  el body JSON, las comprobaciones y la limpieza, sin scripts a nivel de coleccion.
- RegistrarClienteRestAssuredTest comentado linea por linea (given / when / then).
- Documento con el mapa comparativo Postman vs REST Assured, la clasificacion de la
  prueba, la matriz del caso y el paso a paso para probar cada cosa.
</commit_message>
<xml_diff>
--- a/docs/ie2/IE2_Equipo5_Postman_vs_RestAssured.docx
+++ b/docs/ie2/IE2_Equipo5_Postman_vs_RestAssured.docx
@@ -503,7 +503,7 @@
                 <w:b w:val="0"/>
                 <w:sz w:val="18"/>
               </w:rPr>
-              <w:t>Preparación: obtener el token</w:t>
+              <w:t>Seguridad: obtener el token</w:t>
             </w:r>
           </w:p>
         </w:tc>
@@ -518,7 +518,7 @@
                 <w:b w:val="0"/>
                 <w:sz w:val="18"/>
               </w:rPr>
-              <w:t>Script de la colección: hace el login solo antes de la petición.</w:t>
+              <w:t>Pestaña Scripts &gt; Pre-request de la misma petición: hace el login y guarda {{token}}.</w:t>
             </w:r>
           </w:p>
         </w:tc>
@@ -2721,7 +2721,21 @@
                 <w:b w:val="0"/>
                 <w:sz w:val="18"/>
               </w:rPr>
-              <w:t xml:space="preserve"> con las 10 comprobaciones en verde. Cuenta que el login se hizo solo con el script de la colección y que al final se borró el cliente de prueba (se ve en la Console).</w:t>
+              <w:t xml:space="preserve"> con las 10 comprobaciones en verde. Muestra la pestaña </w:t>
+            </w:r>
+            <w:r>
+              <w:rPr>
+                <w:b/>
+                <w:sz w:val="18"/>
+              </w:rPr>
+              <w:t>Scripts</w:t>
+            </w:r>
+            <w:r>
+              <w:rPr>
+                <w:b w:val="0"/>
+                <w:sz w:val="18"/>
+              </w:rPr>
+              <w:t>: en Pre-request está el login (seguridad) y en Post-response las comprobaciones y la limpieza. Todo está en la misma petición.</w:t>
             </w:r>
           </w:p>
         </w:tc>
@@ -3643,7 +3657,7 @@
           <w:b w:val="0"/>
           <w:i w:val="0"/>
         </w:rPr>
-        <w:t>De un login previo (POST /api/usuarios/login). En Postman lo hace el script de la colección; en REST Assured, el @BeforeEach. Es preparación, no parte del caso.</w:t>
+        <w:t>De un login previo (POST /api/usuarios/login). En Postman lo hace el script Pre-request de la misma petición; en REST Assured, el @BeforeEach. Es preparación, no parte del caso.</w:t>
       </w:r>
     </w:p>
     <w:p>

</xml_diff>